<commit_message>
Atualizar funcionalidade dos botões da home
</commit_message>
<xml_diff>
--- a/DOCUMENTACAO/Sistema de Monitoramento em Plantações de Café Arábica.docx
+++ b/DOCUMENTACAO/Sistema de Monitoramento em Plantações de Café Arábica.docx
@@ -1172,28 +1172,11 @@
         <w:spacing w:line="276" w:lineRule="auto"/>
       </w:pPr>
     </w:p>
-    <w:p>
-      <w:r>
-        <w:t>Para dimensionar a magnitude financeira desse impacto, adota-se como modelo de referência uma propriedade agrícola típica com área de 20 hectares e produtividade média de 34,2 sacas por hectare (totalizando aproximadamente 684 sacas de 60 kg por safra):</w:t>
-      </w:r>
-    </w:p>
-    <w:p>
-      <w:pPr>
-        <w:widowControl w:val="0"/>
-        <w:pBdr>
-          <w:top w:val="nil"/>
-          <w:left w:val="nil"/>
-          <w:bottom w:val="nil"/>
-          <w:right w:val="nil"/>
-          <w:between w:val="nil"/>
-        </w:pBdr>
-        <w:spacing w:line="276" w:lineRule="auto"/>
-      </w:pPr>
-    </w:p>
     <w:tbl>
       <w:tblPr>
         <w:tblStyle w:val="a"/>
-        <w:tblW w:w="14000" w:type="dxa"/>
+        <w:tblpPr w:leftFromText="141" w:rightFromText="141" w:vertAnchor="text" w:horzAnchor="margin" w:tblpXSpec="center" w:tblpY="1270"/>
+        <w:tblW w:w="10632" w:type="dxa"/>
         <w:tblInd w:w="0" w:type="dxa"/>
         <w:tblBorders>
           <w:top w:val="single" w:sz="4" w:space="0" w:color="E0E6E3"/>
@@ -1207,10 +1190,10 @@
         <w:tblLook w:val="0620" w:firstRow="1" w:lastRow="0" w:firstColumn="0" w:lastColumn="0" w:noHBand="1" w:noVBand="1"/>
       </w:tblPr>
       <w:tblGrid>
-        <w:gridCol w:w="3500"/>
-        <w:gridCol w:w="3500"/>
-        <w:gridCol w:w="3500"/>
-        <w:gridCol w:w="3500"/>
+        <w:gridCol w:w="2366"/>
+        <w:gridCol w:w="2312"/>
+        <w:gridCol w:w="1843"/>
+        <w:gridCol w:w="4111"/>
       </w:tblGrid>
       <w:tr>
         <w:trPr>
@@ -1219,7 +1202,7 @@
         </w:trPr>
         <w:tc>
           <w:tcPr>
-            <w:tcW w:w="3500" w:type="dxa"/>
+            <w:tcW w:w="2366" w:type="dxa"/>
           </w:tcPr>
           <w:p>
             <w:r>
@@ -1229,7 +1212,7 @@
         </w:tc>
         <w:tc>
           <w:tcPr>
-            <w:tcW w:w="3500" w:type="dxa"/>
+            <w:tcW w:w="2312" w:type="dxa"/>
           </w:tcPr>
           <w:p>
             <w:r>
@@ -1239,7 +1222,7 @@
         </w:tc>
         <w:tc>
           <w:tcPr>
-            <w:tcW w:w="3500" w:type="dxa"/>
+            <w:tcW w:w="1843" w:type="dxa"/>
           </w:tcPr>
           <w:p>
             <w:r>
@@ -1249,7 +1232,7 @@
         </w:tc>
         <w:tc>
           <w:tcPr>
-            <w:tcW w:w="3500" w:type="dxa"/>
+            <w:tcW w:w="4111" w:type="dxa"/>
           </w:tcPr>
           <w:p>
             <w:r>
@@ -1261,7 +1244,7 @@
       <w:tr>
         <w:tc>
           <w:tcPr>
-            <w:tcW w:w="3500" w:type="dxa"/>
+            <w:tcW w:w="2366" w:type="dxa"/>
           </w:tcPr>
           <w:p>
             <w:r>
@@ -1275,7 +1258,7 @@
         </w:tc>
         <w:tc>
           <w:tcPr>
-            <w:tcW w:w="3500" w:type="dxa"/>
+            <w:tcW w:w="2312" w:type="dxa"/>
           </w:tcPr>
           <w:p>
             <w:r>
@@ -1285,7 +1268,7 @@
         </w:tc>
         <w:tc>
           <w:tcPr>
-            <w:tcW w:w="3500" w:type="dxa"/>
+            <w:tcW w:w="1843" w:type="dxa"/>
           </w:tcPr>
           <w:p>
             <w:r>
@@ -1295,7 +1278,7 @@
         </w:tc>
         <w:tc>
           <w:tcPr>
-            <w:tcW w:w="3500" w:type="dxa"/>
+            <w:tcW w:w="4111" w:type="dxa"/>
           </w:tcPr>
           <w:p>
             <w:r>
@@ -1307,7 +1290,7 @@
       <w:tr>
         <w:tc>
           <w:tcPr>
-            <w:tcW w:w="3500" w:type="dxa"/>
+            <w:tcW w:w="2366" w:type="dxa"/>
           </w:tcPr>
           <w:p>
             <w:r>
@@ -1321,7 +1304,7 @@
         </w:tc>
         <w:tc>
           <w:tcPr>
-            <w:tcW w:w="3500" w:type="dxa"/>
+            <w:tcW w:w="2312" w:type="dxa"/>
           </w:tcPr>
           <w:p>
             <w:r>
@@ -1331,7 +1314,7 @@
         </w:tc>
         <w:tc>
           <w:tcPr>
-            <w:tcW w:w="3500" w:type="dxa"/>
+            <w:tcW w:w="1843" w:type="dxa"/>
           </w:tcPr>
           <w:p>
             <w:r>
@@ -1341,7 +1324,7 @@
         </w:tc>
         <w:tc>
           <w:tcPr>
-            <w:tcW w:w="3500" w:type="dxa"/>
+            <w:tcW w:w="4111" w:type="dxa"/>
           </w:tcPr>
           <w:p>
             <w:r>
@@ -1353,7 +1336,7 @@
       <w:tr>
         <w:tc>
           <w:tcPr>
-            <w:tcW w:w="3500" w:type="dxa"/>
+            <w:tcW w:w="2366" w:type="dxa"/>
           </w:tcPr>
           <w:p>
             <w:r>
@@ -1367,7 +1350,7 @@
         </w:tc>
         <w:tc>
           <w:tcPr>
-            <w:tcW w:w="3500" w:type="dxa"/>
+            <w:tcW w:w="2312" w:type="dxa"/>
           </w:tcPr>
           <w:p>
             <w:r>
@@ -1377,7 +1360,7 @@
         </w:tc>
         <w:tc>
           <w:tcPr>
-            <w:tcW w:w="3500" w:type="dxa"/>
+            <w:tcW w:w="1843" w:type="dxa"/>
           </w:tcPr>
           <w:p>
             <w:r>
@@ -1387,7 +1370,7 @@
         </w:tc>
         <w:tc>
           <w:tcPr>
-            <w:tcW w:w="3500" w:type="dxa"/>
+            <w:tcW w:w="4111" w:type="dxa"/>
           </w:tcPr>
           <w:p>
             <w:r>
@@ -1398,6 +1381,11 @@
       </w:tr>
     </w:tbl>
     <w:p>
+      <w:r>
+        <w:t>Para dimensionar a magnitude financeira desse impacto, adota-se como modelo de referência uma propriedade agrícola típica com área de 20 hectares e produtividade média de 34,2 sacas por hectare (totalizando aproximadamente 684 sacas de 60 kg por safra):</w:t>
+      </w:r>
+    </w:p>
+    <w:p>
       <w:pPr>
         <w:widowControl w:val="0"/>
         <w:pBdr>
@@ -1411,15 +1399,6 @@
       </w:pPr>
     </w:p>
     <w:p>
-      <w:r>
-        <w:rPr>
-          <w:i/>
-          <w:iCs/>
-        </w:rPr>
-        <w:t>(Cotação de referência: R$ 1.803,73 por saca de café Arábica de 60 kg)</w:t>
-      </w:r>
-    </w:p>
-    <w:p>
       <w:pPr>
         <w:widowControl w:val="0"/>
         <w:pBdr>
@@ -1434,23 +1413,11 @@
     </w:p>
     <w:p>
       <w:r>
-        <w:t>A amplitude do prejuízo bruto — variando de R$ 246.750,26 a R$ 370.125,39 a cada ciclo de safra — demonstra o tamanho do problema enfrentado pelo produtor e o potencial de valorização de uma solução de monitoramento de baixo custo.</w:t>
-      </w:r>
-    </w:p>
-    <w:p>
-      <w:pPr>
-        <w:pStyle w:val="Ttulo1"/>
-      </w:pPr>
-      <w:bookmarkStart w:id="9" w:name="_qhluscbrbs3q" w:colFirst="0" w:colLast="0"/>
-      <w:bookmarkEnd w:id="9"/>
-      <w:r>
-        <w:lastRenderedPageBreak/>
-        <w:t>1.5 Proposta Tecnológica de Solução IoT</w:t>
-      </w:r>
-    </w:p>
-    <w:p>
-      <w:r>
-        <w:t>Para resolver o gargalo da tomada de decisão empírica, o projeto propõe o desenvolvimento e a implantação de um Sistema IoT de Monitoramento de Umidade do Solo baseada em Hardware Livre.</w:t>
+        <w:rPr>
+          <w:i/>
+          <w:iCs/>
+        </w:rPr>
+        <w:t>(Cotação de referência: R$ 1.803,73 por saca de café Arábica de 60 kg)</w:t>
       </w:r>
     </w:p>
     <w:p>
@@ -1468,266 +1435,23 @@
     </w:p>
     <w:p>
       <w:r>
-        <w:t>A solução consiste na alocação de nódulos de sensoriamento capacitivo instalados diretamente na área de influência de cada pivô ou carretel irrigador (considerando a taxa de cobertura de até 20 hectares por ponto estratégico). Os dados coletados na raiz da planta são processados por um microcontrolador, transmitidos via Wi-Fi para uma infraestrutura na nuvem via APIs REST e apresentados em uma dashboard intuitiva em tempo real.</w:t>
+        <w:lastRenderedPageBreak/>
+        <w:t>A amplitude do prejuízo bruto — variando de R$ 246.750,26 a R$ 370.125,39 a cada ciclo de safra — demonstra o tamanho do problema enfrentado pelo produtor e o potencial de valorização de uma solução de monitoramento de baixo custo.</w:t>
       </w:r>
     </w:p>
     <w:p>
       <w:pPr>
         <w:pStyle w:val="Ttulo1"/>
       </w:pPr>
-      <w:bookmarkStart w:id="10" w:name="_a8n8t5z6bdwc" w:colFirst="0" w:colLast="0"/>
-      <w:bookmarkEnd w:id="10"/>
-      <w:r>
-        <w:t>1.6 Problemas Específicos Mitigados</w:t>
-      </w:r>
-    </w:p>
-    <w:p>
-      <w:pPr>
-        <w:numPr>
-          <w:ilvl w:val="0"/>
-          <w:numId w:val="18"/>
-        </w:numPr>
-      </w:pPr>
-      <w:r>
-        <w:rPr>
-          <w:b/>
-          <w:bCs/>
-        </w:rPr>
-        <w:t>Tomada de decisão empírica:</w:t>
-      </w:r>
-      <w:r>
-        <w:t xml:space="preserve"> Substituição da intuição por dados percentuais objetivos de umidade do solo.</w:t>
-      </w:r>
-    </w:p>
-    <w:p>
-      <w:pPr>
-        <w:numPr>
-          <w:ilvl w:val="0"/>
-          <w:numId w:val="18"/>
-        </w:numPr>
-      </w:pPr>
-      <w:r>
-        <w:rPr>
-          <w:b/>
-          <w:bCs/>
-        </w:rPr>
-        <w:t>Desperdício hídrico e energético:</w:t>
-      </w:r>
-      <w:r>
-        <w:t xml:space="preserve"> Fim da irrigação sobre solos saturados ou em períodos de umidade adequada.</w:t>
-      </w:r>
-    </w:p>
-    <w:p>
-      <w:pPr>
-        <w:numPr>
-          <w:ilvl w:val="0"/>
-          <w:numId w:val="18"/>
-        </w:numPr>
-      </w:pPr>
-      <w:r>
-        <w:rPr>
-          <w:b/>
-          <w:bCs/>
-        </w:rPr>
-        <w:t>Quebra de safra por déficit não detectado:</w:t>
-      </w:r>
-      <w:r>
-        <w:t xml:space="preserve"> Identificação precoce da perda de água do solo antes que a planta atinja o ponto de murcha permanente.</w:t>
-      </w:r>
-    </w:p>
-    <w:p>
-      <w:pPr>
-        <w:numPr>
-          <w:ilvl w:val="0"/>
-          <w:numId w:val="18"/>
-        </w:numPr>
-      </w:pPr>
-      <w:r>
-        <w:rPr>
-          <w:b/>
-          <w:bCs/>
-        </w:rPr>
-        <w:t>Desuniformidade de grãos:</w:t>
-      </w:r>
-      <w:r>
-        <w:t xml:space="preserve"> Suporte preciso ao período de suspensão e retomada de água para padronização da florada.</w:t>
-      </w:r>
-    </w:p>
-    <w:p>
-      <w:pPr>
-        <w:pStyle w:val="Ttulo1"/>
-      </w:pPr>
-      <w:bookmarkStart w:id="11" w:name="_to52brjg7ich" w:colFirst="0" w:colLast="0"/>
-      <w:bookmarkEnd w:id="11"/>
-      <w:r>
-        <w:t>1.7 Principais Funcionalidades para o Cliente</w:t>
-      </w:r>
-    </w:p>
-    <w:p>
-      <w:pPr>
-        <w:numPr>
-          <w:ilvl w:val="0"/>
-          <w:numId w:val="18"/>
-        </w:numPr>
-      </w:pPr>
-      <w:r>
-        <w:rPr>
-          <w:b/>
-          <w:bCs/>
-        </w:rPr>
-        <w:t>Coleta Contínua e Não Invasiva:</w:t>
-      </w:r>
-      <w:r>
-        <w:t xml:space="preserve"> Leitura periódica da umidade do solo por sensores capacitivos resistentes à corrosão.</w:t>
-      </w:r>
-    </w:p>
-    <w:p>
-      <w:pPr>
-        <w:numPr>
-          <w:ilvl w:val="0"/>
-          <w:numId w:val="18"/>
-        </w:numPr>
-      </w:pPr>
-      <w:r>
-        <w:rPr>
-          <w:b/>
-          <w:bCs/>
-        </w:rPr>
-        <w:t>Integração via API e Nuvem:</w:t>
-      </w:r>
-      <w:r>
-        <w:t xml:space="preserve"> Envio autônomo dos pacotes de leitura do campo diretamente para um banco de dados relacional.</w:t>
-      </w:r>
-    </w:p>
-    <w:p>
-      <w:pPr>
-        <w:numPr>
-          <w:ilvl w:val="0"/>
-          <w:numId w:val="18"/>
-        </w:numPr>
-      </w:pPr>
-      <w:r>
-        <w:rPr>
-          <w:b/>
-          <w:bCs/>
-        </w:rPr>
-        <w:t>Dashboard Visual Responsiva:</w:t>
-      </w:r>
-      <w:r>
-        <w:t xml:space="preserve"> Painel web amigável com gráficos de tendência, histórico de umidade e indicativos operacionais.</w:t>
-      </w:r>
-    </w:p>
-    <w:p>
-      <w:pPr>
-        <w:numPr>
-          <w:ilvl w:val="0"/>
-          <w:numId w:val="18"/>
-        </w:numPr>
-      </w:pPr>
-      <w:r>
-        <w:rPr>
-          <w:b/>
-          <w:bCs/>
-        </w:rPr>
-        <w:t>Arquitetura Escalável:</w:t>
-      </w:r>
-      <w:r>
-        <w:t xml:space="preserve"> Possibilidade de adicionar novos nós de monitoramento na mesma propriedade à medida que a área irrigada expande.</w:t>
-      </w:r>
-    </w:p>
-    <w:p>
-      <w:pPr>
-        <w:pStyle w:val="Ttulo1"/>
-      </w:pPr>
-      <w:bookmarkStart w:id="12" w:name="_ru0131jaykcj" w:colFirst="0" w:colLast="0"/>
-      <w:bookmarkEnd w:id="12"/>
-      <w:r>
-        <w:t>1.8 Benefícios para o Negócio e Modelo de Valor</w:t>
-      </w:r>
-    </w:p>
-    <w:p>
-      <w:pPr>
-        <w:numPr>
-          <w:ilvl w:val="0"/>
-          <w:numId w:val="18"/>
-        </w:numPr>
-      </w:pPr>
-      <w:r>
-        <w:rPr>
-          <w:b/>
-          <w:bCs/>
-        </w:rPr>
-        <w:t>Redução de Custos Operacionais (OPEX):</w:t>
-      </w:r>
-      <w:r>
-        <w:t xml:space="preserve"> Menor consumo de quilowatt-hora (kWh) nos motores das bombas de irrigação e menor desgaste de tubulações.</w:t>
-      </w:r>
-    </w:p>
-    <w:p>
-      <w:pPr>
-        <w:numPr>
-          <w:ilvl w:val="0"/>
-          <w:numId w:val="18"/>
-        </w:numPr>
-      </w:pPr>
-      <w:r>
-        <w:rPr>
-          <w:b/>
-          <w:bCs/>
-        </w:rPr>
-        <w:t>Preservação do Ativo Produtivo:</w:t>
-      </w:r>
-      <w:r>
-        <w:t xml:space="preserve"> Retenção da produtividade esperada da safra com a mitigação do estresse hídrico.</w:t>
-      </w:r>
-    </w:p>
-    <w:p>
-      <w:pPr>
-        <w:numPr>
-          <w:ilvl w:val="0"/>
-          <w:numId w:val="18"/>
-        </w:numPr>
-      </w:pPr>
-      <w:r>
-        <w:rPr>
-          <w:b/>
-          <w:bCs/>
-        </w:rPr>
-        <w:t>Acessibilidade Financeira:</w:t>
-      </w:r>
-      <w:r>
-        <w:t xml:space="preserve"> Investimento em hardware de valor extremamente reduzido (R$ 399,90 por ponto) em comparação com estações meteorológicas industriais que custam dezenas de milhares de reais.</w:t>
-      </w:r>
-    </w:p>
-    <w:p>
-      <w:pPr>
-        <w:pStyle w:val="Ttulo1"/>
-      </w:pPr>
-      <w:bookmarkStart w:id="13" w:name="_goglnlcc23dv" w:colFirst="0" w:colLast="0"/>
-      <w:bookmarkEnd w:id="13"/>
-      <w:r>
-        <w:lastRenderedPageBreak/>
-        <w:t>1.9 Tendências Climáticas e Riscos na Cafeicultura Brasileira</w:t>
-      </w:r>
-    </w:p>
-    <w:p>
-      <w:r>
-        <w:t>Estudos recentes do Instituto Nacional de Meteorologia (INMET) e relatórios da FAPESP apontam um aumento substancial na frequência e na severidade das ondas de calor no Brasil. O aumento da temperatura média eleva a taxa de evapotranspiração do solo, reduzindo a retenção hídrica em prazos mais curtos. Em virtude desse cenário de volatilidade climática, sistemas de irrigação gerenciados por rotinas fixas estão fadados à ineficiência, reforçando a urgência da medição contínua.</w:t>
-      </w:r>
-    </w:p>
-    <w:p>
-      <w:pPr>
-        <w:pStyle w:val="Ttulo1"/>
-      </w:pPr>
-      <w:bookmarkStart w:id="14" w:name="_73bumjpr07cn" w:colFirst="0" w:colLast="0"/>
-      <w:bookmarkEnd w:id="14"/>
-      <w:r>
-        <w:t>1.10 Análise Comparativa de Soluções de Mercado</w:t>
-      </w:r>
-    </w:p>
-    <w:p>
-      <w:r>
-        <w:t>Atualmente, as soluções de monitoramento agrícola se dividem em dois extremos:</w:t>
+      <w:bookmarkStart w:id="9" w:name="_qhluscbrbs3q" w:colFirst="0" w:colLast="0"/>
+      <w:bookmarkEnd w:id="9"/>
+      <w:r>
+        <w:t>1.5 Proposta Tecnológica de Solução IoT</w:t>
+      </w:r>
+    </w:p>
+    <w:p>
+      <w:r>
+        <w:t>Para resolver o gargalo da tomada de decisão empírica, o projeto propõe o desenvolvimento e a implantação de um Sistema IoT de Monitoramento de Umidade do Solo baseada em Hardware Livre.</w:t>
       </w:r>
     </w:p>
     <w:p>
@@ -1744,55 +1468,267 @@
       </w:pPr>
     </w:p>
     <w:p>
+      <w:r>
+        <w:t>A solução consiste na alocação de nódulos de sensoriamento capacitivo instalados diretamente na área de influência de cada pivô ou carretel irrigador (considerando a taxa de cobertura de até 20 hectares por ponto estratégico). Os dados coletados na raiz da planta são processados por um microcontrolador, transmitidos via Wi-Fi para uma infraestrutura na nuvem via APIs REST e apresentados em uma dashboard intuitiva em tempo real.</w:t>
+      </w:r>
+    </w:p>
+    <w:p>
+      <w:pPr>
+        <w:pStyle w:val="Ttulo1"/>
+      </w:pPr>
+      <w:bookmarkStart w:id="10" w:name="_a8n8t5z6bdwc" w:colFirst="0" w:colLast="0"/>
+      <w:bookmarkEnd w:id="10"/>
+      <w:r>
+        <w:t>1.6 Problemas Específicos Mitigados</w:t>
+      </w:r>
+    </w:p>
+    <w:p>
       <w:pPr>
         <w:numPr>
           <w:ilvl w:val="0"/>
-          <w:numId w:val="15"/>
-        </w:numPr>
-      </w:pPr>
-      <w:r>
-        <w:rPr>
-          <w:b/>
-          <w:bCs/>
-        </w:rPr>
-        <w:t>Estações industriais e sensores importados de alta precisão:</w:t>
-      </w:r>
-      <w:r>
-        <w:t xml:space="preserve"> Soluções corporativas completas, mas com custo inicial proibitivo para pequenos e médios produtores (acima de R$ 15.000,00 por ponto).</w:t>
+          <w:numId w:val="18"/>
+        </w:numPr>
+      </w:pPr>
+      <w:r>
+        <w:rPr>
+          <w:b/>
+          <w:bCs/>
+        </w:rPr>
+        <w:t>Tomada de decisão empírica:</w:t>
+      </w:r>
+      <w:r>
+        <w:t xml:space="preserve"> Substituição da intuição por dados percentuais objetivos de umidade do solo.</w:t>
       </w:r>
     </w:p>
     <w:p>
       <w:pPr>
         <w:numPr>
           <w:ilvl w:val="0"/>
-          <w:numId w:val="15"/>
-        </w:numPr>
-      </w:pPr>
-      <w:r>
-        <w:rPr>
-          <w:b/>
-          <w:bCs/>
-        </w:rPr>
-        <w:t xml:space="preserve">Projetos acadêmicos e </w:t>
-      </w:r>
-      <w:proofErr w:type="spellStart"/>
-      <w:r>
-        <w:rPr>
-          <w:b/>
-          <w:bCs/>
-        </w:rPr>
-        <w:t>hobbistas</w:t>
-      </w:r>
-      <w:proofErr w:type="spellEnd"/>
-      <w:r>
-        <w:rPr>
-          <w:b/>
-          <w:bCs/>
-        </w:rPr>
-        <w:t xml:space="preserve"> sem integração de software:</w:t>
-      </w:r>
-      <w:r>
-        <w:t xml:space="preserve"> Soluções baseadas em protótipos soltos, que realizam leituras no visor LCD, mas não disponibilizam os dados em APIs centralizadas nem em dashboards de tomada de decisão para o produtor.</w:t>
+          <w:numId w:val="18"/>
+        </w:numPr>
+      </w:pPr>
+      <w:r>
+        <w:rPr>
+          <w:b/>
+          <w:bCs/>
+        </w:rPr>
+        <w:t>Desperdício hídrico e energético:</w:t>
+      </w:r>
+      <w:r>
+        <w:t xml:space="preserve"> Fim da irrigação sobre solos saturados ou em períodos de umidade adequada.</w:t>
+      </w:r>
+    </w:p>
+    <w:p>
+      <w:pPr>
+        <w:numPr>
+          <w:ilvl w:val="0"/>
+          <w:numId w:val="18"/>
+        </w:numPr>
+      </w:pPr>
+      <w:r>
+        <w:rPr>
+          <w:b/>
+          <w:bCs/>
+        </w:rPr>
+        <w:t>Quebra de safra por déficit não detectado:</w:t>
+      </w:r>
+      <w:r>
+        <w:t xml:space="preserve"> Identificação precoce da perda de água do solo antes que a planta atinja o ponto de murcha permanente.</w:t>
+      </w:r>
+    </w:p>
+    <w:p>
+      <w:pPr>
+        <w:numPr>
+          <w:ilvl w:val="0"/>
+          <w:numId w:val="18"/>
+        </w:numPr>
+      </w:pPr>
+      <w:r>
+        <w:rPr>
+          <w:b/>
+          <w:bCs/>
+        </w:rPr>
+        <w:t>Desuniformidade de grãos:</w:t>
+      </w:r>
+      <w:r>
+        <w:t xml:space="preserve"> Suporte preciso ao período de suspensão e retomada de água para padronização da florada.</w:t>
+      </w:r>
+    </w:p>
+    <w:p>
+      <w:pPr>
+        <w:pStyle w:val="Ttulo1"/>
+      </w:pPr>
+      <w:bookmarkStart w:id="11" w:name="_to52brjg7ich" w:colFirst="0" w:colLast="0"/>
+      <w:bookmarkEnd w:id="11"/>
+      <w:r>
+        <w:t>1.7 Principais Funcionalidades para o Cliente</w:t>
+      </w:r>
+    </w:p>
+    <w:p>
+      <w:pPr>
+        <w:numPr>
+          <w:ilvl w:val="0"/>
+          <w:numId w:val="18"/>
+        </w:numPr>
+      </w:pPr>
+      <w:r>
+        <w:rPr>
+          <w:b/>
+          <w:bCs/>
+        </w:rPr>
+        <w:t>Coleta Contínua e Não Invasiva:</w:t>
+      </w:r>
+      <w:r>
+        <w:t xml:space="preserve"> Leitura periódica da umidade do solo por sensores capacitivos resistentes à corrosão.</w:t>
+      </w:r>
+    </w:p>
+    <w:p>
+      <w:pPr>
+        <w:numPr>
+          <w:ilvl w:val="0"/>
+          <w:numId w:val="18"/>
+        </w:numPr>
+      </w:pPr>
+      <w:r>
+        <w:rPr>
+          <w:b/>
+          <w:bCs/>
+        </w:rPr>
+        <w:t>Integração via API e Nuvem:</w:t>
+      </w:r>
+      <w:r>
+        <w:t xml:space="preserve"> Envio autônomo dos pacotes de leitura do campo diretamente para um banco de dados relacional.</w:t>
+      </w:r>
+    </w:p>
+    <w:p>
+      <w:pPr>
+        <w:numPr>
+          <w:ilvl w:val="0"/>
+          <w:numId w:val="18"/>
+        </w:numPr>
+      </w:pPr>
+      <w:r>
+        <w:rPr>
+          <w:b/>
+          <w:bCs/>
+        </w:rPr>
+        <w:t>Dashboard Visual Responsiva:</w:t>
+      </w:r>
+      <w:r>
+        <w:t xml:space="preserve"> Painel web amigável com gráficos de tendência, histórico de umidade e indicativos operacionais.</w:t>
+      </w:r>
+    </w:p>
+    <w:p>
+      <w:pPr>
+        <w:numPr>
+          <w:ilvl w:val="0"/>
+          <w:numId w:val="18"/>
+        </w:numPr>
+      </w:pPr>
+      <w:r>
+        <w:rPr>
+          <w:b/>
+          <w:bCs/>
+        </w:rPr>
+        <w:t>Arquitetura Escalável:</w:t>
+      </w:r>
+      <w:r>
+        <w:t xml:space="preserve"> Possibilidade de adicionar novos nós de monitoramento na mesma propriedade à medida que a área irrigada expande.</w:t>
+      </w:r>
+    </w:p>
+    <w:p>
+      <w:pPr>
+        <w:pStyle w:val="Ttulo1"/>
+      </w:pPr>
+      <w:bookmarkStart w:id="12" w:name="_ru0131jaykcj" w:colFirst="0" w:colLast="0"/>
+      <w:bookmarkEnd w:id="12"/>
+      <w:r>
+        <w:t>1.8 Benefícios para o Negócio e Modelo de Valor</w:t>
+      </w:r>
+    </w:p>
+    <w:p>
+      <w:pPr>
+        <w:numPr>
+          <w:ilvl w:val="0"/>
+          <w:numId w:val="18"/>
+        </w:numPr>
+      </w:pPr>
+      <w:r>
+        <w:rPr>
+          <w:b/>
+          <w:bCs/>
+        </w:rPr>
+        <w:t>Redução de Custos Operacionais (OPEX):</w:t>
+      </w:r>
+      <w:r>
+        <w:t xml:space="preserve"> Menor consumo de quilowatt-hora (kWh) nos motores das bombas de irrigação e menor desgaste de tubulações.</w:t>
+      </w:r>
+    </w:p>
+    <w:p>
+      <w:pPr>
+        <w:numPr>
+          <w:ilvl w:val="0"/>
+          <w:numId w:val="18"/>
+        </w:numPr>
+      </w:pPr>
+      <w:r>
+        <w:rPr>
+          <w:b/>
+          <w:bCs/>
+        </w:rPr>
+        <w:t>Preservação do Ativo Produtivo:</w:t>
+      </w:r>
+      <w:r>
+        <w:t xml:space="preserve"> Retenção da produtividade esperada da safra com a mitigação do estresse hídrico.</w:t>
+      </w:r>
+    </w:p>
+    <w:p>
+      <w:pPr>
+        <w:numPr>
+          <w:ilvl w:val="0"/>
+          <w:numId w:val="18"/>
+        </w:numPr>
+      </w:pPr>
+      <w:r>
+        <w:rPr>
+          <w:b/>
+          <w:bCs/>
+        </w:rPr>
+        <w:lastRenderedPageBreak/>
+        <w:t>Acessibilidade Financeira:</w:t>
+      </w:r>
+      <w:r>
+        <w:t xml:space="preserve"> Investimento em hardware de valor extremamente reduzido (R$ 399,90 por ponto) em comparação com estações meteorológicas industriais que custam dezenas de milhares de reais.</w:t>
+      </w:r>
+    </w:p>
+    <w:p>
+      <w:pPr>
+        <w:pStyle w:val="Ttulo1"/>
+      </w:pPr>
+      <w:bookmarkStart w:id="13" w:name="_goglnlcc23dv" w:colFirst="0" w:colLast="0"/>
+      <w:bookmarkEnd w:id="13"/>
+      <w:r>
+        <w:t>1.9 Tendências Climáticas e Riscos na Cafeicultura Brasileira</w:t>
+      </w:r>
+    </w:p>
+    <w:p>
+      <w:r>
+        <w:t>Estudos recentes do Instituto Nacional de Meteorologia (INMET) e relatórios da FAPESP apontam um aumento substancial na frequência e na severidade das ondas de calor no Brasil. O aumento da temperatura média eleva a taxa de evapotranspiração do solo, reduzindo a retenção hídrica em prazos mais curtos. Em virtude desse cenário de volatilidade climática, sistemas de irrigação gerenciados por rotinas fixas estão fadados à ineficiência, reforçando a urgência da medição contínua.</w:t>
+      </w:r>
+    </w:p>
+    <w:p>
+      <w:pPr>
+        <w:pStyle w:val="Ttulo1"/>
+      </w:pPr>
+      <w:bookmarkStart w:id="14" w:name="_73bumjpr07cn" w:colFirst="0" w:colLast="0"/>
+      <w:bookmarkEnd w:id="14"/>
+      <w:r>
+        <w:t>1.10 Análise Comparativa de Soluções de Mercado</w:t>
+      </w:r>
+    </w:p>
+    <w:p>
+      <w:r>
+        <w:t>Atualmente, as soluções de monitoramento agrícola se dividem em dois extremos:</w:t>
       </w:r>
     </w:p>
     <w:p>
@@ -1809,8 +1745,55 @@
       </w:pPr>
     </w:p>
     <w:p>
-      <w:r>
-        <w:t>O presente projeto preenche a lacuna intermediária: hardware acessível com arquitetura corporativa de software e visualização web.</w:t>
+      <w:pPr>
+        <w:numPr>
+          <w:ilvl w:val="0"/>
+          <w:numId w:val="15"/>
+        </w:numPr>
+      </w:pPr>
+      <w:r>
+        <w:rPr>
+          <w:b/>
+          <w:bCs/>
+        </w:rPr>
+        <w:t>Estações industriais e sensores importados de alta precisão:</w:t>
+      </w:r>
+      <w:r>
+        <w:t xml:space="preserve"> Soluções corporativas completas, mas com custo inicial proibitivo para pequenos e médios produtores (acima de R$ 15.000,00 por ponto).</w:t>
+      </w:r>
+    </w:p>
+    <w:p>
+      <w:pPr>
+        <w:numPr>
+          <w:ilvl w:val="0"/>
+          <w:numId w:val="15"/>
+        </w:numPr>
+      </w:pPr>
+      <w:r>
+        <w:rPr>
+          <w:b/>
+          <w:bCs/>
+        </w:rPr>
+        <w:t xml:space="preserve">Projetos acadêmicos e </w:t>
+      </w:r>
+      <w:proofErr w:type="spellStart"/>
+      <w:r>
+        <w:rPr>
+          <w:b/>
+          <w:bCs/>
+        </w:rPr>
+        <w:t>hobbistas</w:t>
+      </w:r>
+      <w:proofErr w:type="spellEnd"/>
+      <w:r>
+        <w:rPr>
+          <w:b/>
+          <w:bCs/>
+        </w:rPr>
+        <w:t xml:space="preserve"> sem integração de software:</w:t>
+      </w:r>
+      <w:r>
+        <w:t xml:space="preserve"> Soluções baseadas em protótipos soltos, que realizam leituras no visor LCD, mas não disponibilizam os dados em APIs centralizadas nem em dashboards de tomada de decisão para o produtor.</w:t>
       </w:r>
     </w:p>
     <w:p>
@@ -1828,143 +1811,7 @@
     </w:p>
     <w:p>
       <w:r>
-        <w:pict w14:anchorId="278D5332">
-          <v:rect id="_x0000_i1028" style="width:0;height:1.5pt" o:hralign="center" o:hrstd="t" o:hr="t" fillcolor="#a0a0a0" stroked="f"/>
-        </w:pict>
-      </w:r>
-    </w:p>
-    <w:p>
-      <w:pPr>
-        <w:pStyle w:val="Ttulo"/>
-      </w:pPr>
-      <w:bookmarkStart w:id="15" w:name="_fawxsxzih8v" w:colFirst="0" w:colLast="0"/>
-      <w:bookmarkEnd w:id="15"/>
-      <w:r>
-        <w:t>2. OBJETIVO</w:t>
-      </w:r>
-    </w:p>
-    <w:p>
-      <w:pPr>
-        <w:pStyle w:val="Ttulo1"/>
-      </w:pPr>
-      <w:bookmarkStart w:id="16" w:name="_388dnss9hjdp" w:colFirst="0" w:colLast="0"/>
-      <w:bookmarkEnd w:id="16"/>
-      <w:r>
-        <w:t>2.1 Objetivo Geral</w:t>
-      </w:r>
-    </w:p>
-    <w:p>
-      <w:r>
-        <w:t>Desenvolver, validar e documentar um sistema integrado de monitoramento de umidade do solo utilizando um sensor capacitivo conectado a um microcontrolador Arduino Uno R3 (com suporte Wi-Fi via módulo ESP8266), responsável pela leitura periódica das condições hídricas da raiz da planta, transmissão automática via requisições HTTP REST para uma API de armazenamento em banco de dados e disponibilização dos dados históricos e operacionais em uma dashboard web voltada ao suporte à tomada de decisão de cafeicultores de café Arábica.</w:t>
-      </w:r>
-    </w:p>
-    <w:p>
-      <w:pPr>
-        <w:pStyle w:val="Ttulo1"/>
-      </w:pPr>
-      <w:bookmarkStart w:id="17" w:name="_nvfsdd4mqrqw" w:colFirst="0" w:colLast="0"/>
-      <w:bookmarkEnd w:id="17"/>
-      <w:r>
-        <w:t>2.2 Objetivos Específicos (Critérios SMART)</w:t>
-      </w:r>
-    </w:p>
-    <w:p>
-      <w:pPr>
-        <w:numPr>
-          <w:ilvl w:val="0"/>
-          <w:numId w:val="1"/>
-        </w:numPr>
-      </w:pPr>
-      <w:r>
-        <w:rPr>
-          <w:b/>
-          <w:bCs/>
-        </w:rPr>
-        <w:t>S (Específico):</w:t>
-      </w:r>
-      <w:r>
-        <w:t xml:space="preserve"> Construir um protótipo físico capaz de ler a tensão analógica do sensor capacitivo de solo, convertê-la em percentual de umidade (0% a 100%) e transmiti-la via rede sem fio.</w:t>
-      </w:r>
-    </w:p>
-    <w:p>
-      <w:pPr>
-        <w:numPr>
-          <w:ilvl w:val="0"/>
-          <w:numId w:val="1"/>
-        </w:numPr>
-      </w:pPr>
-      <w:r>
-        <w:rPr>
-          <w:b/>
-          <w:bCs/>
-        </w:rPr>
-        <w:lastRenderedPageBreak/>
-        <w:t>M (Mensurável):</w:t>
-      </w:r>
-      <w:r>
-        <w:t xml:space="preserve"> Garantir a precisão da transmissão de dados em pacotes JSON com taxa de sucesso nas requisições HTTP para as APIs superior a 95% e intervalos de coleta parametrizáveis entre 5 e 10 minutos.</w:t>
-      </w:r>
-    </w:p>
-    <w:p>
-      <w:pPr>
-        <w:numPr>
-          <w:ilvl w:val="0"/>
-          <w:numId w:val="1"/>
-        </w:numPr>
-      </w:pPr>
-      <w:r>
-        <w:rPr>
-          <w:b/>
-          <w:bCs/>
-        </w:rPr>
-        <w:t>A (Atingível):</w:t>
-      </w:r>
-      <w:r>
-        <w:t xml:space="preserve"> Utilizar componentes amplamente disponíveis no mercado nacional de eletrônica comercial (Arduino Uno R3, módulo ESP8266 e sensor capacitivo v1.2).</w:t>
-      </w:r>
-    </w:p>
-    <w:p>
-      <w:pPr>
-        <w:numPr>
-          <w:ilvl w:val="0"/>
-          <w:numId w:val="1"/>
-        </w:numPr>
-      </w:pPr>
-      <w:r>
-        <w:rPr>
-          <w:b/>
-          <w:bCs/>
-        </w:rPr>
-        <w:t>R (Relevante):</w:t>
-      </w:r>
-      <w:r>
-        <w:t xml:space="preserve"> Proporcionar ao produtor um indicador claro que ajude a evitar a perda de sacas por estresse hídrico </w:t>
-      </w:r>
-      <w:proofErr w:type="spellStart"/>
-      <w:r>
-        <w:t>indesehado</w:t>
-      </w:r>
-      <w:proofErr w:type="spellEnd"/>
-      <w:r>
-        <w:t xml:space="preserve"> e reduza o consumo de água e energia elétrica.</w:t>
-      </w:r>
-    </w:p>
-    <w:p>
-      <w:pPr>
-        <w:numPr>
-          <w:ilvl w:val="0"/>
-          <w:numId w:val="1"/>
-        </w:numPr>
-      </w:pPr>
-      <w:r>
-        <w:rPr>
-          <w:b/>
-          <w:bCs/>
-        </w:rPr>
-        <w:t>T (Temporal):</w:t>
-      </w:r>
-      <w:r>
-        <w:t xml:space="preserve"> Finalizar a montagem do protótipo, o desenvolvimento das APIs, a integração da dashboard e a calibração no ambiente simulado até o término do semestre letivo do curso.</w:t>
+        <w:t>O presente projeto preenche a lacuna intermediária: hardware acessível com arquitetura corporativa de software e visualização web.</w:t>
       </w:r>
     </w:p>
     <w:p>
@@ -1982,8 +1829,8 @@
     </w:p>
     <w:p>
       <w:r>
-        <w:pict w14:anchorId="73BD5B56">
-          <v:rect id="_x0000_i1029" style="width:0;height:1.5pt" o:hralign="center" o:hrstd="t" o:hr="t" fillcolor="#a0a0a0" stroked="f"/>
+        <w:pict w14:anchorId="278D5332">
+          <v:rect id="_x0000_i1028" style="width:0;height:1.5pt" o:hralign="center" o:hrstd="t" o:hr="t" fillcolor="#a0a0a0" stroked="f"/>
         </w:pict>
       </w:r>
     </w:p>
@@ -1991,25 +1838,134 @@
       <w:pPr>
         <w:pStyle w:val="Ttulo"/>
       </w:pPr>
-      <w:bookmarkStart w:id="18" w:name="_yuwo8491n0lq" w:colFirst="0" w:colLast="0"/>
-      <w:bookmarkEnd w:id="18"/>
-      <w:r>
-        <w:t>3. JUSTIFICATIVA E POTENCIAL DE RETORNO</w:t>
+      <w:bookmarkStart w:id="15" w:name="_fawxsxzih8v" w:colFirst="0" w:colLast="0"/>
+      <w:bookmarkEnd w:id="15"/>
+      <w:r>
+        <w:t>2. OBJETIVO</w:t>
       </w:r>
     </w:p>
     <w:p>
       <w:pPr>
         <w:pStyle w:val="Ttulo1"/>
       </w:pPr>
-      <w:bookmarkStart w:id="19" w:name="_1aqm9yytkxef" w:colFirst="0" w:colLast="0"/>
-      <w:bookmarkEnd w:id="19"/>
-      <w:r>
-        <w:t>3.1 O Problema em Números e Sensibilidade Financeira</w:t>
-      </w:r>
-    </w:p>
-    <w:p>
-      <w:r>
-        <w:t>Conforme detalhado no Contexto, uma propriedade de café Arábica com 20 hectares pode perder até 205 sacas por safra devido ao estresse hídrico mal administrado, totalizando um prejuízo de mais de R$ 370.000,00.</w:t>
+      <w:bookmarkStart w:id="16" w:name="_388dnss9hjdp" w:colFirst="0" w:colLast="0"/>
+      <w:bookmarkEnd w:id="16"/>
+      <w:r>
+        <w:t>2.1 Objetivo Geral</w:t>
+      </w:r>
+    </w:p>
+    <w:p>
+      <w:r>
+        <w:t>Desenvolver, validar e documentar um sistema integrado de monitoramento de umidade do solo utilizando um sensor capacitivo conectado a um microcontrolador Arduino Uno R3 (com suporte Wi-Fi via módulo ESP8266), responsável pela leitura periódica das condições hídricas da raiz da planta, transmissão automática via requisições HTTP REST para uma API de armazenamento em banco de dados e disponibilização dos dados históricos e operacionais em uma dashboard web voltada ao suporte à tomada de decisão de cafeicultores de café Arábica.</w:t>
+      </w:r>
+    </w:p>
+    <w:p>
+      <w:pPr>
+        <w:pStyle w:val="Ttulo1"/>
+      </w:pPr>
+      <w:bookmarkStart w:id="17" w:name="_nvfsdd4mqrqw" w:colFirst="0" w:colLast="0"/>
+      <w:bookmarkEnd w:id="17"/>
+      <w:r>
+        <w:lastRenderedPageBreak/>
+        <w:t>2.2 Objetivos Específicos (Critérios SMART)</w:t>
+      </w:r>
+    </w:p>
+    <w:p>
+      <w:pPr>
+        <w:numPr>
+          <w:ilvl w:val="0"/>
+          <w:numId w:val="1"/>
+        </w:numPr>
+      </w:pPr>
+      <w:r>
+        <w:rPr>
+          <w:b/>
+          <w:bCs/>
+        </w:rPr>
+        <w:t>S (Específico):</w:t>
+      </w:r>
+      <w:r>
+        <w:t xml:space="preserve"> Construir um protótipo físico capaz de ler a tensão analógica do sensor capacitivo de solo, convertê-la em percentual de umidade (0% a 100%) e transmiti-la via rede sem fio.</w:t>
+      </w:r>
+    </w:p>
+    <w:p>
+      <w:pPr>
+        <w:numPr>
+          <w:ilvl w:val="0"/>
+          <w:numId w:val="1"/>
+        </w:numPr>
+      </w:pPr>
+      <w:r>
+        <w:rPr>
+          <w:b/>
+          <w:bCs/>
+        </w:rPr>
+        <w:t>M (Mensurável):</w:t>
+      </w:r>
+      <w:r>
+        <w:t xml:space="preserve"> Garantir a precisão da transmissão de dados em pacotes JSON com taxa de sucesso nas requisições HTTP para as APIs superior a 95% e intervalos de coleta parametrizáveis entre 5 e 10 minutos.</w:t>
+      </w:r>
+    </w:p>
+    <w:p>
+      <w:pPr>
+        <w:numPr>
+          <w:ilvl w:val="0"/>
+          <w:numId w:val="1"/>
+        </w:numPr>
+      </w:pPr>
+      <w:r>
+        <w:rPr>
+          <w:b/>
+          <w:bCs/>
+        </w:rPr>
+        <w:t>A (Atingível):</w:t>
+      </w:r>
+      <w:r>
+        <w:t xml:space="preserve"> Utilizar componentes amplamente disponíveis no mercado nacional de eletrônica comercial (Arduino Uno R3, módulo ESP8266 e sensor capacitivo v1.2).</w:t>
+      </w:r>
+    </w:p>
+    <w:p>
+      <w:pPr>
+        <w:numPr>
+          <w:ilvl w:val="0"/>
+          <w:numId w:val="1"/>
+        </w:numPr>
+      </w:pPr>
+      <w:r>
+        <w:rPr>
+          <w:b/>
+          <w:bCs/>
+        </w:rPr>
+        <w:t>R (Relevante):</w:t>
+      </w:r>
+      <w:r>
+        <w:t xml:space="preserve"> Proporcionar ao produtor um indicador claro que ajude a evitar a perda de sacas por estresse hídrico </w:t>
+      </w:r>
+      <w:proofErr w:type="spellStart"/>
+      <w:r>
+        <w:t>indesehado</w:t>
+      </w:r>
+      <w:proofErr w:type="spellEnd"/>
+      <w:r>
+        <w:t xml:space="preserve"> e reduza o consumo de água e energia elétrica.</w:t>
+      </w:r>
+    </w:p>
+    <w:p>
+      <w:pPr>
+        <w:numPr>
+          <w:ilvl w:val="0"/>
+          <w:numId w:val="1"/>
+        </w:numPr>
+      </w:pPr>
+      <w:r>
+        <w:rPr>
+          <w:b/>
+          <w:bCs/>
+        </w:rPr>
+        <w:t>T (Temporal):</w:t>
+      </w:r>
+      <w:r>
+        <w:t xml:space="preserve"> Finalizar a montagem do protótipo, o desenvolvimento das APIs, a integração da dashboard e a calibração no ambiente simulado até o término do semestre letivo do curso.</w:t>
       </w:r>
     </w:p>
     <w:p>
@@ -2027,45 +1983,34 @@
     </w:p>
     <w:p>
       <w:r>
-        <w:t>Mesmo quando a perda por falta de controle é marginal (por exemplo, a perda de apenas 1 a 2 sacas de café por ano), a escala do valor financeiro do café Arábica no mercado de commodities torna a prevenção do dano extremamente valiosa.</w:t>
+        <w:pict w14:anchorId="73BD5B56">
+          <v:rect id="_x0000_i1029" style="width:0;height:1.5pt" o:hralign="center" o:hrstd="t" o:hr="t" fillcolor="#a0a0a0" stroked="f"/>
+        </w:pict>
+      </w:r>
+    </w:p>
+    <w:p>
+      <w:pPr>
+        <w:pStyle w:val="Ttulo"/>
+      </w:pPr>
+      <w:bookmarkStart w:id="18" w:name="_yuwo8491n0lq" w:colFirst="0" w:colLast="0"/>
+      <w:bookmarkEnd w:id="18"/>
+      <w:r>
+        <w:t>3. JUSTIFICATIVA E POTENCIAL DE RETORNO</w:t>
       </w:r>
     </w:p>
     <w:p>
       <w:pPr>
         <w:pStyle w:val="Ttulo1"/>
       </w:pPr>
-      <w:bookmarkStart w:id="20" w:name="_a4cg2puc2wxu" w:colFirst="0" w:colLast="0"/>
-      <w:bookmarkEnd w:id="20"/>
-      <w:r>
-        <w:t>3.2 A Arquitetura da Solução de Baixo Custo</w:t>
-      </w:r>
-    </w:p>
-    <w:p>
-      <w:r>
-        <w:t>A premissa fundamental da solução proposta é entregar valor ao produtor sem exigir aportes financeiros elevados. Enquanto tecnologias tradicionais exigem infraestrutura proprietária cara, a arquitetura com componentes comerciais e software web responsivo viabiliza um modelo de baixo custo e alta eficiência.</w:t>
-      </w:r>
-    </w:p>
-    <w:p>
-      <w:pPr>
-        <w:pStyle w:val="Ttulo1"/>
-      </w:pPr>
-      <w:bookmarkStart w:id="21" w:name="_tzso511ang17" w:colFirst="0" w:colLast="0"/>
-      <w:bookmarkEnd w:id="21"/>
-      <w:r>
-        <w:t>3.3 Potencial de Retorno Financeiro (</w:t>
-      </w:r>
-      <w:proofErr w:type="spellStart"/>
-      <w:r>
-        <w:t>Payback</w:t>
-      </w:r>
-      <w:proofErr w:type="spellEnd"/>
-      <w:r>
-        <w:t xml:space="preserve"> e ROI)</w:t>
-      </w:r>
-    </w:p>
-    <w:p>
-      <w:r>
-        <w:t>Para demonstrar a viabilidade econômica ao produtor agrícola, apresenta-se a estrutura de investimentos do modelo comercial proposto:</w:t>
+      <w:bookmarkStart w:id="19" w:name="_1aqm9yytkxef" w:colFirst="0" w:colLast="0"/>
+      <w:bookmarkEnd w:id="19"/>
+      <w:r>
+        <w:t>3.1 O Problema em Números e Sensibilidade Financeira</w:t>
+      </w:r>
+    </w:p>
+    <w:p>
+      <w:r>
+        <w:t>Conforme detalhado no Contexto, uma propriedade de café Arábica com 20 hectares pode perder até 205 sacas por safra devido ao estresse hídrico mal administrado, totalizando um prejuízo de mais de R$ 370.000,00.</w:t>
       </w:r>
     </w:p>
     <w:p>
@@ -2082,58 +2027,46 @@
       </w:pPr>
     </w:p>
     <w:p>
-      <w:pPr>
-        <w:numPr>
-          <w:ilvl w:val="0"/>
-          <w:numId w:val="7"/>
-        </w:numPr>
-      </w:pPr>
-      <w:r>
-        <w:rPr>
-          <w:b/>
-          <w:bCs/>
-        </w:rPr>
-        <w:t>Taxa de Instalação do Ponto de Monitoramento (CAPEX):</w:t>
-      </w:r>
-      <w:r>
-        <w:t xml:space="preserve"> R$ 399,90 (inclui microcontrolador, sensor capacitivo, fonte de alimentação, gabinete protetor, montagem e calibração inicial).</w:t>
-      </w:r>
-    </w:p>
-    <w:p>
-      <w:pPr>
-        <w:numPr>
-          <w:ilvl w:val="0"/>
-          <w:numId w:val="7"/>
-        </w:numPr>
-      </w:pPr>
-      <w:r>
-        <w:rPr>
-          <w:b/>
-          <w:bCs/>
-        </w:rPr>
-        <w:t>Mensalidade de Software e Infraestrutura Cloud (OPEX):</w:t>
-      </w:r>
-      <w:r>
-        <w:t xml:space="preserve"> R$ 99,90 / mês (totalizando R$ 1.198,80 ao longo de 12 meses).</w:t>
-      </w:r>
-    </w:p>
-    <w:p>
-      <w:pPr>
-        <w:numPr>
-          <w:ilvl w:val="0"/>
-          <w:numId w:val="7"/>
-        </w:numPr>
-      </w:pPr>
-      <w:r>
-        <w:rPr>
-          <w:b/>
-          <w:bCs/>
-        </w:rPr>
-        <w:lastRenderedPageBreak/>
-        <w:t>Custo Total no Primeiro Ano:</w:t>
-      </w:r>
-      <w:r>
-        <w:t xml:space="preserve"> R$ 399,90 + R$ 1.198,80 = R$ 1.598,70 por irrigador/ponto instalado.</w:t>
+      <w:r>
+        <w:t>Mesmo quando a perda por falta de controle é marginal (por exemplo, a perda de apenas 1 a 2 sacas de café por ano), a escala do valor financeiro do café Arábica no mercado de commodities torna a prevenção do dano extremamente valiosa.</w:t>
+      </w:r>
+    </w:p>
+    <w:p>
+      <w:pPr>
+        <w:pStyle w:val="Ttulo1"/>
+      </w:pPr>
+      <w:bookmarkStart w:id="20" w:name="_a4cg2puc2wxu" w:colFirst="0" w:colLast="0"/>
+      <w:bookmarkEnd w:id="20"/>
+      <w:r>
+        <w:t>3.2 A Arquitetura da Solução de Baixo Custo</w:t>
+      </w:r>
+    </w:p>
+    <w:p>
+      <w:r>
+        <w:t>A premissa fundamental da solução proposta é entregar valor ao produtor sem exigir aportes financeiros elevados. Enquanto tecnologias tradicionais exigem infraestrutura proprietária cara, a arquitetura com componentes comerciais e software web responsivo viabiliza um modelo de baixo custo e alta eficiência.</w:t>
+      </w:r>
+    </w:p>
+    <w:p>
+      <w:pPr>
+        <w:pStyle w:val="Ttulo1"/>
+      </w:pPr>
+      <w:bookmarkStart w:id="21" w:name="_tzso511ang17" w:colFirst="0" w:colLast="0"/>
+      <w:bookmarkEnd w:id="21"/>
+      <w:r>
+        <w:t>3.3 Potencial de Retorno Financeiro (</w:t>
+      </w:r>
+      <w:proofErr w:type="spellStart"/>
+      <w:r>
+        <w:t>Payback</w:t>
+      </w:r>
+      <w:proofErr w:type="spellEnd"/>
+      <w:r>
+        <w:t xml:space="preserve"> e ROI)</w:t>
+      </w:r>
+    </w:p>
+    <w:p>
+      <w:r>
+        <w:t>Para demonstrar a viabilidade econômica ao produtor agrícola, apresenta-se a estrutura de investimentos do modelo comercial proposto:</w:t>
       </w:r>
     </w:p>
     <w:p>
@@ -2149,104 +2082,11 @@
         <w:spacing w:line="276" w:lineRule="auto"/>
       </w:pPr>
     </w:p>
-    <w:p>
-      <w:r>
-        <w:rPr>
-          <w:b/>
-          <w:bCs/>
-        </w:rPr>
-        <w:t xml:space="preserve">Cálculo de Viabilidade e </w:t>
-      </w:r>
-      <w:proofErr w:type="spellStart"/>
-      <w:r>
-        <w:rPr>
-          <w:b/>
-          <w:bCs/>
-        </w:rPr>
-        <w:t>Payback</w:t>
-      </w:r>
-      <w:proofErr w:type="spellEnd"/>
-      <w:r>
-        <w:rPr>
-          <w:b/>
-          <w:bCs/>
-        </w:rPr>
-        <w:t>:</w:t>
-      </w:r>
-    </w:p>
-    <w:p>
-      <w:pPr>
-        <w:widowControl w:val="0"/>
-        <w:pBdr>
-          <w:top w:val="nil"/>
-          <w:left w:val="nil"/>
-          <w:bottom w:val="nil"/>
-          <w:right w:val="nil"/>
-          <w:between w:val="nil"/>
-        </w:pBdr>
-        <w:spacing w:line="276" w:lineRule="auto"/>
-      </w:pPr>
-    </w:p>
-    <w:p>
-      <w:pPr>
-        <w:numPr>
-          <w:ilvl w:val="0"/>
-          <w:numId w:val="7"/>
-        </w:numPr>
-      </w:pPr>
-      <w:r>
-        <w:t>Valor de 1 saca de café Arábica (60 kg): R$ 1.803,73.</w:t>
-      </w:r>
-    </w:p>
-    <w:p>
-      <w:pPr>
-        <w:numPr>
-          <w:ilvl w:val="0"/>
-          <w:numId w:val="7"/>
-        </w:numPr>
-      </w:pPr>
-      <w:r>
-        <w:t>Custo de implantação + 1 ano de serviço: R$ 1.598,70.</w:t>
-      </w:r>
-    </w:p>
-    <w:p>
-      <w:pPr>
-        <w:numPr>
-          <w:ilvl w:val="0"/>
-          <w:numId w:val="7"/>
-        </w:numPr>
-      </w:pPr>
-      <w:r>
-        <w:t xml:space="preserve">Retorno Líquido ao preservar apenas 1 saca: R$ 1.803,73 - R$ 1.598,70 = </w:t>
-      </w:r>
-      <w:r>
-        <w:rPr>
-          <w:b/>
-          <w:bCs/>
-        </w:rPr>
-        <w:t>+ R$ 205,03</w:t>
-      </w:r>
-      <w:r>
-        <w:t xml:space="preserve"> de saldo positivo logo no 1º ano.</w:t>
-      </w:r>
-    </w:p>
-    <w:p>
-      <w:pPr>
-        <w:widowControl w:val="0"/>
-        <w:pBdr>
-          <w:top w:val="nil"/>
-          <w:left w:val="nil"/>
-          <w:bottom w:val="nil"/>
-          <w:right w:val="nil"/>
-          <w:between w:val="nil"/>
-        </w:pBdr>
-        <w:spacing w:line="276" w:lineRule="auto"/>
-      </w:pPr>
-    </w:p>
     <w:tbl>
       <w:tblPr>
         <w:tblStyle w:val="a0"/>
-        <w:tblW w:w="17500" w:type="dxa"/>
+        <w:tblpPr w:leftFromText="141" w:rightFromText="141" w:vertAnchor="page" w:horzAnchor="margin" w:tblpX="-567" w:tblpY="2691"/>
+        <w:tblW w:w="9923" w:type="dxa"/>
         <w:tblInd w:w="0" w:type="dxa"/>
         <w:tblBorders>
           <w:top w:val="single" w:sz="4" w:space="0" w:color="E0E6E3"/>
@@ -2260,11 +2100,11 @@
         <w:tblLook w:val="0620" w:firstRow="1" w:lastRow="0" w:firstColumn="0" w:lastColumn="0" w:noHBand="1" w:noVBand="1"/>
       </w:tblPr>
       <w:tblGrid>
-        <w:gridCol w:w="3500"/>
-        <w:gridCol w:w="3500"/>
-        <w:gridCol w:w="3500"/>
-        <w:gridCol w:w="3500"/>
-        <w:gridCol w:w="3500"/>
+        <w:gridCol w:w="1513"/>
+        <w:gridCol w:w="1888"/>
+        <w:gridCol w:w="2268"/>
+        <w:gridCol w:w="1985"/>
+        <w:gridCol w:w="2269"/>
       </w:tblGrid>
       <w:tr>
         <w:trPr>
@@ -2273,50 +2113,101 @@
         </w:trPr>
         <w:tc>
           <w:tcPr>
-            <w:tcW w:w="3500" w:type="dxa"/>
+            <w:tcW w:w="1513" w:type="dxa"/>
           </w:tcPr>
           <w:p>
+            <w:pPr>
+              <w:rPr>
+                <w:sz w:val="16"/>
+                <w:szCs w:val="16"/>
+              </w:rPr>
+            </w:pPr>
             <w:r>
+              <w:rPr>
+                <w:sz w:val="16"/>
+                <w:szCs w:val="16"/>
+              </w:rPr>
+              <w:lastRenderedPageBreak/>
               <w:t>Sacas Salvas (Ano)</w:t>
             </w:r>
           </w:p>
         </w:tc>
         <w:tc>
           <w:tcPr>
-            <w:tcW w:w="3500" w:type="dxa"/>
+            <w:tcW w:w="1888" w:type="dxa"/>
           </w:tcPr>
           <w:p>
+            <w:pPr>
+              <w:rPr>
+                <w:sz w:val="16"/>
+                <w:szCs w:val="16"/>
+              </w:rPr>
+            </w:pPr>
             <w:r>
+              <w:rPr>
+                <w:sz w:val="16"/>
+                <w:szCs w:val="16"/>
+              </w:rPr>
               <w:t>Ganho Bruto (R$)</w:t>
             </w:r>
           </w:p>
         </w:tc>
         <w:tc>
           <w:tcPr>
-            <w:tcW w:w="3500" w:type="dxa"/>
+            <w:tcW w:w="2268" w:type="dxa"/>
           </w:tcPr>
           <w:p>
+            <w:pPr>
+              <w:rPr>
+                <w:sz w:val="16"/>
+                <w:szCs w:val="16"/>
+              </w:rPr>
+            </w:pPr>
             <w:r>
+              <w:rPr>
+                <w:sz w:val="16"/>
+                <w:szCs w:val="16"/>
+              </w:rPr>
               <w:t>Custo Total 1º Ano (R$)</w:t>
             </w:r>
           </w:p>
         </w:tc>
         <w:tc>
           <w:tcPr>
-            <w:tcW w:w="3500" w:type="dxa"/>
+            <w:tcW w:w="1985" w:type="dxa"/>
           </w:tcPr>
           <w:p>
+            <w:pPr>
+              <w:rPr>
+                <w:sz w:val="16"/>
+                <w:szCs w:val="16"/>
+              </w:rPr>
+            </w:pPr>
             <w:r>
+              <w:rPr>
+                <w:sz w:val="16"/>
+                <w:szCs w:val="16"/>
+              </w:rPr>
               <w:t>Lucro Líquido (R$)</w:t>
             </w:r>
           </w:p>
         </w:tc>
         <w:tc>
           <w:tcPr>
-            <w:tcW w:w="3500" w:type="dxa"/>
+            <w:tcW w:w="2269" w:type="dxa"/>
           </w:tcPr>
           <w:p>
+            <w:pPr>
+              <w:rPr>
+                <w:sz w:val="16"/>
+                <w:szCs w:val="16"/>
+              </w:rPr>
+            </w:pPr>
             <w:r>
+              <w:rPr>
+                <w:sz w:val="16"/>
+                <w:szCs w:val="16"/>
+              </w:rPr>
               <w:t>ROI (%)</w:t>
             </w:r>
           </w:p>
@@ -2325,13 +2216,21 @@
       <w:tr>
         <w:tc>
           <w:tcPr>
-            <w:tcW w:w="3500" w:type="dxa"/>
+            <w:tcW w:w="1513" w:type="dxa"/>
           </w:tcPr>
           <w:p>
+            <w:pPr>
+              <w:rPr>
+                <w:sz w:val="16"/>
+                <w:szCs w:val="16"/>
+              </w:rPr>
+            </w:pPr>
             <w:r>
               <w:rPr>
                 <w:b/>
                 <w:bCs/>
+                <w:sz w:val="16"/>
+                <w:szCs w:val="16"/>
               </w:rPr>
               <w:t>1 saca</w:t>
             </w:r>
@@ -2339,40 +2238,80 @@
         </w:tc>
         <w:tc>
           <w:tcPr>
-            <w:tcW w:w="3500" w:type="dxa"/>
+            <w:tcW w:w="1888" w:type="dxa"/>
           </w:tcPr>
           <w:p>
+            <w:pPr>
+              <w:rPr>
+                <w:sz w:val="16"/>
+                <w:szCs w:val="16"/>
+              </w:rPr>
+            </w:pPr>
             <w:r>
+              <w:rPr>
+                <w:sz w:val="16"/>
+                <w:szCs w:val="16"/>
+              </w:rPr>
               <w:t>R$ 1.803,73</w:t>
             </w:r>
           </w:p>
         </w:tc>
         <w:tc>
           <w:tcPr>
-            <w:tcW w:w="3500" w:type="dxa"/>
+            <w:tcW w:w="2268" w:type="dxa"/>
           </w:tcPr>
           <w:p>
+            <w:pPr>
+              <w:rPr>
+                <w:sz w:val="16"/>
+                <w:szCs w:val="16"/>
+              </w:rPr>
+            </w:pPr>
             <w:r>
+              <w:rPr>
+                <w:sz w:val="16"/>
+                <w:szCs w:val="16"/>
+              </w:rPr>
               <w:t>R$ 1.598,70</w:t>
             </w:r>
           </w:p>
         </w:tc>
         <w:tc>
           <w:tcPr>
-            <w:tcW w:w="3500" w:type="dxa"/>
+            <w:tcW w:w="1985" w:type="dxa"/>
           </w:tcPr>
           <w:p>
+            <w:pPr>
+              <w:rPr>
+                <w:sz w:val="16"/>
+                <w:szCs w:val="16"/>
+              </w:rPr>
+            </w:pPr>
             <w:r>
+              <w:rPr>
+                <w:sz w:val="16"/>
+                <w:szCs w:val="16"/>
+              </w:rPr>
               <w:t>R$ 205,03</w:t>
             </w:r>
           </w:p>
         </w:tc>
         <w:tc>
           <w:tcPr>
-            <w:tcW w:w="3500" w:type="dxa"/>
+            <w:tcW w:w="2269" w:type="dxa"/>
           </w:tcPr>
           <w:p>
+            <w:pPr>
+              <w:rPr>
+                <w:sz w:val="16"/>
+                <w:szCs w:val="16"/>
+              </w:rPr>
+            </w:pPr>
             <w:r>
+              <w:rPr>
+                <w:sz w:val="16"/>
+                <w:szCs w:val="16"/>
+              </w:rPr>
               <w:t>12,8%</w:t>
             </w:r>
           </w:p>
@@ -2381,13 +2320,21 @@
       <w:tr>
         <w:tc>
           <w:tcPr>
-            <w:tcW w:w="3500" w:type="dxa"/>
+            <w:tcW w:w="1513" w:type="dxa"/>
           </w:tcPr>
           <w:p>
+            <w:pPr>
+              <w:rPr>
+                <w:sz w:val="16"/>
+                <w:szCs w:val="16"/>
+              </w:rPr>
+            </w:pPr>
             <w:r>
               <w:rPr>
                 <w:b/>
                 <w:bCs/>
+                <w:sz w:val="16"/>
+                <w:szCs w:val="16"/>
               </w:rPr>
               <w:t>3 sacas</w:t>
             </w:r>
@@ -2395,40 +2342,80 @@
         </w:tc>
         <w:tc>
           <w:tcPr>
-            <w:tcW w:w="3500" w:type="dxa"/>
+            <w:tcW w:w="1888" w:type="dxa"/>
           </w:tcPr>
           <w:p>
+            <w:pPr>
+              <w:rPr>
+                <w:sz w:val="16"/>
+                <w:szCs w:val="16"/>
+              </w:rPr>
+            </w:pPr>
             <w:r>
+              <w:rPr>
+                <w:sz w:val="16"/>
+                <w:szCs w:val="16"/>
+              </w:rPr>
               <w:t>R$ 5.411,19</w:t>
             </w:r>
           </w:p>
         </w:tc>
         <w:tc>
           <w:tcPr>
-            <w:tcW w:w="3500" w:type="dxa"/>
+            <w:tcW w:w="2268" w:type="dxa"/>
           </w:tcPr>
           <w:p>
+            <w:pPr>
+              <w:rPr>
+                <w:sz w:val="16"/>
+                <w:szCs w:val="16"/>
+              </w:rPr>
+            </w:pPr>
             <w:r>
+              <w:rPr>
+                <w:sz w:val="16"/>
+                <w:szCs w:val="16"/>
+              </w:rPr>
               <w:t>R$ 1.598,70</w:t>
             </w:r>
           </w:p>
         </w:tc>
         <w:tc>
           <w:tcPr>
-            <w:tcW w:w="3500" w:type="dxa"/>
+            <w:tcW w:w="1985" w:type="dxa"/>
           </w:tcPr>
           <w:p>
+            <w:pPr>
+              <w:rPr>
+                <w:sz w:val="16"/>
+                <w:szCs w:val="16"/>
+              </w:rPr>
+            </w:pPr>
             <w:r>
+              <w:rPr>
+                <w:sz w:val="16"/>
+                <w:szCs w:val="16"/>
+              </w:rPr>
               <w:t>R$ 3.812,49</w:t>
             </w:r>
           </w:p>
         </w:tc>
         <w:tc>
           <w:tcPr>
-            <w:tcW w:w="3500" w:type="dxa"/>
+            <w:tcW w:w="2269" w:type="dxa"/>
           </w:tcPr>
           <w:p>
+            <w:pPr>
+              <w:rPr>
+                <w:sz w:val="16"/>
+                <w:szCs w:val="16"/>
+              </w:rPr>
+            </w:pPr>
             <w:r>
+              <w:rPr>
+                <w:sz w:val="16"/>
+                <w:szCs w:val="16"/>
+              </w:rPr>
               <w:t>238,5%</w:t>
             </w:r>
           </w:p>
@@ -2437,13 +2424,21 @@
       <w:tr>
         <w:tc>
           <w:tcPr>
-            <w:tcW w:w="3500" w:type="dxa"/>
+            <w:tcW w:w="1513" w:type="dxa"/>
           </w:tcPr>
           <w:p>
+            <w:pPr>
+              <w:rPr>
+                <w:sz w:val="16"/>
+                <w:szCs w:val="16"/>
+              </w:rPr>
+            </w:pPr>
             <w:r>
               <w:rPr>
                 <w:b/>
                 <w:bCs/>
+                <w:sz w:val="16"/>
+                <w:szCs w:val="16"/>
               </w:rPr>
               <w:t>5 sacas</w:t>
             </w:r>
@@ -2451,55 +2446,106 @@
         </w:tc>
         <w:tc>
           <w:tcPr>
-            <w:tcW w:w="3500" w:type="dxa"/>
+            <w:tcW w:w="1888" w:type="dxa"/>
           </w:tcPr>
           <w:p>
+            <w:pPr>
+              <w:rPr>
+                <w:sz w:val="16"/>
+                <w:szCs w:val="16"/>
+              </w:rPr>
+            </w:pPr>
             <w:r>
+              <w:rPr>
+                <w:sz w:val="16"/>
+                <w:szCs w:val="16"/>
+              </w:rPr>
               <w:t>R$ 9.018,65</w:t>
             </w:r>
           </w:p>
         </w:tc>
         <w:tc>
           <w:tcPr>
-            <w:tcW w:w="3500" w:type="dxa"/>
+            <w:tcW w:w="2268" w:type="dxa"/>
           </w:tcPr>
           <w:p>
+            <w:pPr>
+              <w:rPr>
+                <w:sz w:val="16"/>
+                <w:szCs w:val="16"/>
+              </w:rPr>
+            </w:pPr>
             <w:r>
+              <w:rPr>
+                <w:sz w:val="16"/>
+                <w:szCs w:val="16"/>
+              </w:rPr>
               <w:t>R$ 1.598,70</w:t>
             </w:r>
           </w:p>
         </w:tc>
         <w:tc>
           <w:tcPr>
-            <w:tcW w:w="3500" w:type="dxa"/>
+            <w:tcW w:w="1985" w:type="dxa"/>
           </w:tcPr>
           <w:p>
+            <w:pPr>
+              <w:rPr>
+                <w:sz w:val="16"/>
+                <w:szCs w:val="16"/>
+              </w:rPr>
+            </w:pPr>
             <w:r>
+              <w:rPr>
+                <w:sz w:val="16"/>
+                <w:szCs w:val="16"/>
+              </w:rPr>
               <w:t>R$ 7.419,95</w:t>
             </w:r>
           </w:p>
         </w:tc>
         <w:tc>
           <w:tcPr>
-            <w:tcW w:w="3500" w:type="dxa"/>
+            <w:tcW w:w="2269" w:type="dxa"/>
           </w:tcPr>
           <w:p>
+            <w:pPr>
+              <w:rPr>
+                <w:sz w:val="16"/>
+                <w:szCs w:val="16"/>
+              </w:rPr>
+            </w:pPr>
             <w:r>
+              <w:rPr>
+                <w:sz w:val="16"/>
+                <w:szCs w:val="16"/>
+              </w:rPr>
               <w:t>464,1%</w:t>
             </w:r>
           </w:p>
         </w:tc>
       </w:tr>
       <w:tr>
+        <w:trPr>
+          <w:trHeight w:val="20"/>
+        </w:trPr>
         <w:tc>
           <w:tcPr>
-            <w:tcW w:w="3500" w:type="dxa"/>
+            <w:tcW w:w="1513" w:type="dxa"/>
           </w:tcPr>
           <w:p>
+            <w:pPr>
+              <w:rPr>
+                <w:sz w:val="16"/>
+                <w:szCs w:val="16"/>
+              </w:rPr>
+            </w:pPr>
             <w:r>
               <w:rPr>
                 <w:b/>
                 <w:bCs/>
+                <w:sz w:val="16"/>
+                <w:szCs w:val="16"/>
               </w:rPr>
               <w:t>10 sacas</w:t>
             </w:r>
@@ -2507,46 +2553,140 @@
         </w:tc>
         <w:tc>
           <w:tcPr>
-            <w:tcW w:w="3500" w:type="dxa"/>
+            <w:tcW w:w="1888" w:type="dxa"/>
           </w:tcPr>
           <w:p>
+            <w:pPr>
+              <w:rPr>
+                <w:sz w:val="16"/>
+                <w:szCs w:val="16"/>
+              </w:rPr>
+            </w:pPr>
             <w:r>
+              <w:rPr>
+                <w:sz w:val="16"/>
+                <w:szCs w:val="16"/>
+              </w:rPr>
               <w:t>R$ 18.037,30</w:t>
             </w:r>
           </w:p>
         </w:tc>
         <w:tc>
           <w:tcPr>
-            <w:tcW w:w="3500" w:type="dxa"/>
+            <w:tcW w:w="2268" w:type="dxa"/>
           </w:tcPr>
           <w:p>
+            <w:pPr>
+              <w:rPr>
+                <w:sz w:val="16"/>
+                <w:szCs w:val="16"/>
+              </w:rPr>
+            </w:pPr>
             <w:r>
+              <w:rPr>
+                <w:sz w:val="16"/>
+                <w:szCs w:val="16"/>
+              </w:rPr>
               <w:t>R$ 1.598,70</w:t>
             </w:r>
           </w:p>
         </w:tc>
         <w:tc>
           <w:tcPr>
-            <w:tcW w:w="3500" w:type="dxa"/>
+            <w:tcW w:w="1985" w:type="dxa"/>
           </w:tcPr>
           <w:p>
+            <w:pPr>
+              <w:rPr>
+                <w:sz w:val="16"/>
+                <w:szCs w:val="16"/>
+              </w:rPr>
+            </w:pPr>
             <w:r>
+              <w:rPr>
+                <w:sz w:val="16"/>
+                <w:szCs w:val="16"/>
+              </w:rPr>
               <w:t>R$ 16.438,60</w:t>
             </w:r>
           </w:p>
         </w:tc>
         <w:tc>
           <w:tcPr>
-            <w:tcW w:w="3500" w:type="dxa"/>
+            <w:tcW w:w="2269" w:type="dxa"/>
           </w:tcPr>
           <w:p>
+            <w:pPr>
+              <w:rPr>
+                <w:sz w:val="16"/>
+                <w:szCs w:val="16"/>
+              </w:rPr>
+            </w:pPr>
             <w:r>
+              <w:rPr>
+                <w:sz w:val="16"/>
+                <w:szCs w:val="16"/>
+              </w:rPr>
               <w:t>1.028,2%</w:t>
             </w:r>
           </w:p>
         </w:tc>
       </w:tr>
     </w:tbl>
+    <w:p>
+      <w:pPr>
+        <w:numPr>
+          <w:ilvl w:val="0"/>
+          <w:numId w:val="7"/>
+        </w:numPr>
+      </w:pPr>
+      <w:r>
+        <w:rPr>
+          <w:b/>
+          <w:bCs/>
+        </w:rPr>
+        <w:t>Taxa de Instalação do Ponto de Monitoramento (CAPEX):</w:t>
+      </w:r>
+      <w:r>
+        <w:t xml:space="preserve"> R$ 399,90 (inclui microcontrolador, sensor capacitivo, fonte de alimentação, gabinete protetor, montagem e calibração inicial).</w:t>
+      </w:r>
+    </w:p>
+    <w:p>
+      <w:pPr>
+        <w:numPr>
+          <w:ilvl w:val="0"/>
+          <w:numId w:val="7"/>
+        </w:numPr>
+      </w:pPr>
+      <w:r>
+        <w:rPr>
+          <w:b/>
+          <w:bCs/>
+        </w:rPr>
+        <w:t>Mensalidade de Software e Infraestrutura Cloud (OPEX):</w:t>
+      </w:r>
+      <w:r>
+        <w:t xml:space="preserve"> R$ 99,90 / mês (totalizando R$ 1.198,80 ao longo de 12 meses).</w:t>
+      </w:r>
+    </w:p>
+    <w:p>
+      <w:pPr>
+        <w:numPr>
+          <w:ilvl w:val="0"/>
+          <w:numId w:val="7"/>
+        </w:numPr>
+      </w:pPr>
+      <w:r>
+        <w:rPr>
+          <w:b/>
+          <w:bCs/>
+        </w:rPr>
+        <w:t>Custo Total no Primeiro Ano:</w:t>
+      </w:r>
+      <w:r>
+        <w:t xml:space="preserve"> R$ 399,90 + R$ 1.198,80 = R$ 1.598,70 por irrigador/ponto instalado.</w:t>
+      </w:r>
+    </w:p>
     <w:p>
       <w:pPr>
         <w:widowControl w:val="0"/>
@@ -2562,53 +2702,27 @@
     </w:p>
     <w:p>
       <w:r>
-        <w:t xml:space="preserve">Assim, o </w:t>
+        <w:rPr>
+          <w:b/>
+          <w:bCs/>
+        </w:rPr>
+        <w:t xml:space="preserve">Cálculo de Viabilidade e </w:t>
       </w:r>
       <w:proofErr w:type="spellStart"/>
       <w:r>
-        <w:t>payback</w:t>
+        <w:rPr>
+          <w:b/>
+          <w:bCs/>
+        </w:rPr>
+        <w:t>Payback</w:t>
       </w:r>
       <w:proofErr w:type="spellEnd"/>
       <w:r>
-        <w:t xml:space="preserve"> do investimento ocorre </w:t>
-      </w:r>
-      <w:proofErr w:type="gramStart"/>
-      <w:r>
-        <w:t>no momento em que</w:t>
-      </w:r>
-      <w:proofErr w:type="gramEnd"/>
-      <w:r>
-        <w:t xml:space="preserve"> a primeira saca de café deixa de ser perdida por erro no manejo de irrigação, o que comprova a atratividade comercial do sistema.</w:t>
-      </w:r>
-    </w:p>
-    <w:p>
-      <w:pPr>
-        <w:pStyle w:val="Ttulo1"/>
-      </w:pPr>
-      <w:bookmarkStart w:id="22" w:name="_m8lv0suuindr" w:colFirst="0" w:colLast="0"/>
-      <w:bookmarkEnd w:id="22"/>
-      <w:r>
-        <w:t>3.4 Ressalvas e Variáveis de Contorno</w:t>
-      </w:r>
-    </w:p>
-    <w:p>
-      <w:r>
-        <w:t>Os cálculos expostos representam estimativas de potencial econômico e não constituem garantia absoluta de lucro. O resultado efetivo obtido por cada cafeicultor varia em função das características físicas do solo (textura arenosa, argilosa ou franca), das condições pluviométricas da região, do custo local do quilowatt-hora da concessionária de energia e da disciplina operacional na resposta aos alertas emitidos pelo sistema.</w:t>
-      </w:r>
-    </w:p>
-    <w:p>
-      <w:pPr>
-        <w:pStyle w:val="Ttulo1"/>
-      </w:pPr>
-      <w:bookmarkStart w:id="23" w:name="_r6wusn8owzvg" w:colFirst="0" w:colLast="0"/>
-      <w:bookmarkEnd w:id="23"/>
-      <w:r>
-        <w:t>3.5 Modelo de Comercialização, Serviços e Repasses</w:t>
-      </w:r>
-    </w:p>
-    <w:p>
-      <w:r>
-        <w:t>O modelo de negócios é estruturado no formato Software as a Service (SaaS) atrelado ao fornecimento de hardware em comodato ou venda simplificada:</w:t>
+        <w:rPr>
+          <w:b/>
+          <w:bCs/>
+        </w:rPr>
+        <w:t>:</w:t>
       </w:r>
     </w:p>
     <w:p>
@@ -2628,36 +2742,43 @@
       <w:pPr>
         <w:numPr>
           <w:ilvl w:val="0"/>
-          <w:numId w:val="14"/>
-        </w:numPr>
-      </w:pPr>
-      <w:r>
-        <w:rPr>
-          <w:b/>
-          <w:bCs/>
-        </w:rPr>
-        <w:t>Comercialização por Ponto (Irrigador):</w:t>
-      </w:r>
-      <w:r>
-        <w:t xml:space="preserve"> O dimensionamento é escalável. Propriedades maiores pagam proporcionalmente à quantidade de módulos coletores instalados.</w:t>
+          <w:numId w:val="7"/>
+        </w:numPr>
+      </w:pPr>
+      <w:r>
+        <w:t>Valor de 1 saca de café Arábica (60 kg): R$ 1.803,73.</w:t>
       </w:r>
     </w:p>
     <w:p>
       <w:pPr>
         <w:numPr>
           <w:ilvl w:val="0"/>
-          <w:numId w:val="14"/>
-        </w:numPr>
-      </w:pPr>
-      <w:r>
-        <w:rPr>
-          <w:b/>
-          <w:bCs/>
-        </w:rPr>
-        <w:t>Escopo da Mensalidade:</w:t>
-      </w:r>
-      <w:r>
-        <w:t xml:space="preserve"> Cobre a hospedagem das APIs de recepção e consulta, banco de dados na nuvem, manutenção preventiva/corretiva do hardware e atualizações na dashboard.</w:t>
+          <w:numId w:val="7"/>
+        </w:numPr>
+      </w:pPr>
+      <w:r>
+        <w:t>Custo de implantação + 1 ano de serviço: R$ 1.598,70.</w:t>
+      </w:r>
+    </w:p>
+    <w:p>
+      <w:pPr>
+        <w:numPr>
+          <w:ilvl w:val="0"/>
+          <w:numId w:val="7"/>
+        </w:numPr>
+      </w:pPr>
+      <w:r>
+        <w:t xml:space="preserve">Retorno Líquido ao preservar apenas 1 saca: R$ 1.803,73 - R$ 1.598,70 = </w:t>
+      </w:r>
+      <w:r>
+        <w:rPr>
+          <w:b/>
+          <w:bCs/>
+        </w:rPr>
+        <w:t>+ R$ 205,03</w:t>
+      </w:r>
+      <w:r>
+        <w:t xml:space="preserve"> de saldo positivo logo no 1º ano.</w:t>
       </w:r>
     </w:p>
     <w:p>
@@ -2674,58 +2795,6 @@
       </w:pPr>
     </w:p>
     <w:p>
-      <w:r>
-        <w:pict w14:anchorId="4265D898">
-          <v:rect id="_x0000_i1030" style="width:0;height:1.5pt" o:hralign="center" o:hrstd="t" o:hr="t" fillcolor="#a0a0a0" stroked="f"/>
-        </w:pict>
-      </w:r>
-    </w:p>
-    <w:p>
-      <w:pPr>
-        <w:pStyle w:val="Ttulo"/>
-      </w:pPr>
-      <w:bookmarkStart w:id="24" w:name="_f0vicdx4yl2n" w:colFirst="0" w:colLast="0"/>
-      <w:bookmarkEnd w:id="24"/>
-      <w:r>
-        <w:lastRenderedPageBreak/>
-        <w:t>4. ESCOPO DO PROJETO</w:t>
-      </w:r>
-    </w:p>
-    <w:p>
-      <w:pPr>
-        <w:pStyle w:val="Ttulo1"/>
-      </w:pPr>
-      <w:bookmarkStart w:id="25" w:name="_o7e4t7590oi1" w:colFirst="0" w:colLast="0"/>
-      <w:bookmarkEnd w:id="25"/>
-      <w:r>
-        <w:t>4.1 Descrição Resumida</w:t>
-      </w:r>
-    </w:p>
-    <w:p>
-      <w:r>
-        <w:t>O projeto engloba o desenvolvimento de um protótipo funcional de monitoramento contínuo da umidade do solo para cafezais. O sistema utiliza um sensor capacitivo conectado ao microcontrolador Arduino Uno R3, responsável pelo envio de pacotes de dados via módulo Wi-Fi ESP8266 para uma API REST que os grava em um banco de dados relacional. Uma segunda API serve de interface para uma dashboard web, permitindo a visualização gráfica e o acompanhamento histórico das medições pelo produtor.</w:t>
-      </w:r>
-    </w:p>
-    <w:p>
-      <w:pPr>
-        <w:pStyle w:val="Ttulo1"/>
-      </w:pPr>
-      <w:bookmarkStart w:id="26" w:name="_atmeq8n5kcvw" w:colFirst="0" w:colLast="0"/>
-      <w:bookmarkEnd w:id="26"/>
-      <w:r>
-        <w:t>4.2 Requisitos Funcionais e Não-Funcionais</w:t>
-      </w:r>
-    </w:p>
-    <w:p>
-      <w:r>
-        <w:rPr>
-          <w:b/>
-          <w:bCs/>
-        </w:rPr>
-        <w:t>Requisitos Funcionais (RF):</w:t>
-      </w:r>
-    </w:p>
-    <w:p>
       <w:pPr>
         <w:widowControl w:val="0"/>
         <w:pBdr>
@@ -2739,101 +2808,46 @@
       </w:pPr>
     </w:p>
     <w:p>
-      <w:pPr>
-        <w:numPr>
-          <w:ilvl w:val="0"/>
-          <w:numId w:val="5"/>
-        </w:numPr>
-      </w:pPr>
-      <w:r>
-        <w:rPr>
-          <w:b/>
-          <w:bCs/>
-        </w:rPr>
-        <w:t>RF01:</w:t>
-      </w:r>
-      <w:r>
-        <w:t xml:space="preserve"> Ler continuamente o sinal analógico transmitido pelo sensor capacitivo de solo.</w:t>
-      </w:r>
-    </w:p>
-    <w:p>
-      <w:pPr>
-        <w:numPr>
-          <w:ilvl w:val="0"/>
-          <w:numId w:val="5"/>
-        </w:numPr>
-      </w:pPr>
-      <w:r>
-        <w:rPr>
-          <w:b/>
-          <w:bCs/>
-        </w:rPr>
-        <w:t>RF02:</w:t>
-      </w:r>
-      <w:r>
-        <w:t xml:space="preserve"> Converter a leitura de tensão em uma escala percentual ajustada de 0% (solo seco) a 100% (solo saturado).</w:t>
-      </w:r>
-    </w:p>
-    <w:p>
-      <w:pPr>
-        <w:numPr>
-          <w:ilvl w:val="0"/>
-          <w:numId w:val="5"/>
-        </w:numPr>
-      </w:pPr>
-      <w:r>
-        <w:rPr>
-          <w:b/>
-          <w:bCs/>
-        </w:rPr>
-        <w:t>RF03:</w:t>
-      </w:r>
-      <w:r>
-        <w:t xml:space="preserve"> Transmitir a leitura percentual via requisição HTTP POST em formato JSON para a API de ingestão.</w:t>
-      </w:r>
-    </w:p>
-    <w:p>
-      <w:pPr>
-        <w:numPr>
-          <w:ilvl w:val="0"/>
-          <w:numId w:val="5"/>
-        </w:numPr>
-      </w:pPr>
-      <w:r>
-        <w:rPr>
-          <w:b/>
-          <w:bCs/>
-        </w:rPr>
-        <w:t>RF04:</w:t>
-      </w:r>
-      <w:r>
-        <w:t xml:space="preserve"> Armazenar os registros com </w:t>
+      <w:r>
+        <w:t xml:space="preserve">Assim, o </w:t>
       </w:r>
       <w:proofErr w:type="spellStart"/>
       <w:r>
-        <w:t>timestamp</w:t>
+        <w:t>payback</w:t>
       </w:r>
       <w:proofErr w:type="spellEnd"/>
       <w:r>
-        <w:t xml:space="preserve"> no banco de dados.</w:t>
-      </w:r>
-    </w:p>
-    <w:p>
-      <w:pPr>
-        <w:numPr>
-          <w:ilvl w:val="0"/>
-          <w:numId w:val="5"/>
-        </w:numPr>
-      </w:pPr>
-      <w:r>
-        <w:rPr>
-          <w:b/>
-          <w:bCs/>
-        </w:rPr>
-        <w:t>RF05:</w:t>
-      </w:r>
-      <w:r>
-        <w:t xml:space="preserve"> Exibir em painel web a última leitura e o histórico gráfico do perfil de umidade.</w:t>
+        <w:t xml:space="preserve"> do investimento ocorre no momento em que a primeira saca de café deixa de ser perdida por erro no manejo de irrigação, o que comprova a atratividade comercial do sistema.</w:t>
+      </w:r>
+    </w:p>
+    <w:p>
+      <w:pPr>
+        <w:pStyle w:val="Ttulo1"/>
+      </w:pPr>
+      <w:bookmarkStart w:id="22" w:name="_m8lv0suuindr" w:colFirst="0" w:colLast="0"/>
+      <w:bookmarkEnd w:id="22"/>
+      <w:r>
+        <w:t>3.4 Ressalvas e Variáveis de Contorno</w:t>
+      </w:r>
+    </w:p>
+    <w:p>
+      <w:r>
+        <w:t>Os cálculos expostos representam estimativas de potencial econômico e não constituem garantia absoluta de lucro. O resultado efetivo obtido por cada cafeicultor varia em função das características físicas do solo (textura arenosa, argilosa ou franca), das condições pluviométricas da região, do custo local do quilowatt-hora da concessionária de energia e da disciplina operacional na resposta aos alertas emitidos pelo sistema.</w:t>
+      </w:r>
+    </w:p>
+    <w:p>
+      <w:pPr>
+        <w:pStyle w:val="Ttulo1"/>
+      </w:pPr>
+      <w:bookmarkStart w:id="23" w:name="_r6wusn8owzvg" w:colFirst="0" w:colLast="0"/>
+      <w:bookmarkEnd w:id="23"/>
+      <w:r>
+        <w:t>3.5 Modelo de Comercialização, Serviços e Repasses</w:t>
+      </w:r>
+    </w:p>
+    <w:p>
+      <w:r>
+        <w:t>O modelo de negócios é estruturado no formato Software as a Service (SaaS) atrelado ao fornecimento de hardware em comodato ou venda simplificada:</w:t>
       </w:r>
     </w:p>
     <w:p>
@@ -2850,12 +2864,40 @@
       </w:pPr>
     </w:p>
     <w:p>
-      <w:r>
-        <w:rPr>
-          <w:b/>
-          <w:bCs/>
-        </w:rPr>
-        <w:t>Requisitos Não-Funcionais (RNF):</w:t>
+      <w:pPr>
+        <w:numPr>
+          <w:ilvl w:val="0"/>
+          <w:numId w:val="14"/>
+        </w:numPr>
+      </w:pPr>
+      <w:r>
+        <w:rPr>
+          <w:b/>
+          <w:bCs/>
+        </w:rPr>
+        <w:t>Comercialização por Ponto (Irrigador):</w:t>
+      </w:r>
+      <w:r>
+        <w:t xml:space="preserve"> O dimensionamento é escalável. Propriedades maiores pagam proporcionalmente à quantidade de módulos coletores instalados.</w:t>
+      </w:r>
+    </w:p>
+    <w:p>
+      <w:pPr>
+        <w:numPr>
+          <w:ilvl w:val="0"/>
+          <w:numId w:val="14"/>
+        </w:numPr>
+      </w:pPr>
+      <w:r>
+        <w:rPr>
+          <w:b/>
+          <w:bCs/>
+        </w:rPr>
+        <w:lastRenderedPageBreak/>
+        <w:t>Escopo da Mensalidade:</w:t>
+      </w:r>
+      <w:r>
+        <w:t xml:space="preserve"> Cobre a hospedagem das APIs de recepção e consulta, banco de dados na nuvem, manutenção preventiva/corretiva do hardware e atualizações na dashboard.</w:t>
       </w:r>
     </w:p>
     <w:p>
@@ -2872,6 +2914,70 @@
       </w:pPr>
     </w:p>
     <w:p>
+      <w:r>
+        <w:pict w14:anchorId="4265D898">
+          <v:rect id="_x0000_i1030" style="width:0;height:1.5pt" o:hralign="center" o:hrstd="t" o:hr="t" fillcolor="#a0a0a0" stroked="f"/>
+        </w:pict>
+      </w:r>
+    </w:p>
+    <w:p>
+      <w:pPr>
+        <w:pStyle w:val="Ttulo"/>
+      </w:pPr>
+      <w:bookmarkStart w:id="24" w:name="_f0vicdx4yl2n" w:colFirst="0" w:colLast="0"/>
+      <w:bookmarkEnd w:id="24"/>
+      <w:r>
+        <w:t>4. ESCOPO DO PROJETO</w:t>
+      </w:r>
+    </w:p>
+    <w:p>
+      <w:pPr>
+        <w:pStyle w:val="Ttulo1"/>
+      </w:pPr>
+      <w:bookmarkStart w:id="25" w:name="_o7e4t7590oi1" w:colFirst="0" w:colLast="0"/>
+      <w:bookmarkEnd w:id="25"/>
+      <w:r>
+        <w:t>4.1 Descrição Resumida</w:t>
+      </w:r>
+    </w:p>
+    <w:p>
+      <w:r>
+        <w:t>O projeto engloba o desenvolvimento de um protótipo funcional de monitoramento contínuo da umidade do solo para cafezais. O sistema utiliza um sensor capacitivo conectado ao microcontrolador Arduino Uno R3, responsável pelo envio de pacotes de dados via módulo Wi-Fi ESP8266 para uma API REST que os grava em um banco de dados relacional. Uma segunda API serve de interface para uma dashboard web, permitindo a visualização gráfica e o acompanhamento histórico das medições pelo produtor.</w:t>
+      </w:r>
+    </w:p>
+    <w:p>
+      <w:pPr>
+        <w:pStyle w:val="Ttulo1"/>
+      </w:pPr>
+      <w:bookmarkStart w:id="26" w:name="_atmeq8n5kcvw" w:colFirst="0" w:colLast="0"/>
+      <w:bookmarkEnd w:id="26"/>
+      <w:r>
+        <w:t>4.2 Requisitos Funcionais e Não-Funcionais</w:t>
+      </w:r>
+    </w:p>
+    <w:p>
+      <w:r>
+        <w:rPr>
+          <w:b/>
+          <w:bCs/>
+        </w:rPr>
+        <w:t>Requisitos Funcionais (RF):</w:t>
+      </w:r>
+    </w:p>
+    <w:p>
+      <w:pPr>
+        <w:widowControl w:val="0"/>
+        <w:pBdr>
+          <w:top w:val="nil"/>
+          <w:left w:val="nil"/>
+          <w:bottom w:val="nil"/>
+          <w:right w:val="nil"/>
+          <w:between w:val="nil"/>
+        </w:pBdr>
+        <w:spacing w:line="276" w:lineRule="auto"/>
+      </w:pPr>
+    </w:p>
+    <w:p>
       <w:pPr>
         <w:numPr>
           <w:ilvl w:val="0"/>
@@ -2883,10 +2989,10 @@
           <w:b/>
           <w:bCs/>
         </w:rPr>
-        <w:t>RNF01:</w:t>
-      </w:r>
-      <w:r>
-        <w:t xml:space="preserve"> Tempo de resposta da API de ingestão inferior a 2 segundos por requisição.</w:t>
+        <w:t>RF01:</w:t>
+      </w:r>
+      <w:r>
+        <w:t xml:space="preserve"> Ler continuamente o sinal analógico transmitido pelo sensor capacitivo de solo.</w:t>
       </w:r>
     </w:p>
     <w:p>
@@ -2901,10 +3007,10 @@
           <w:b/>
           <w:bCs/>
         </w:rPr>
-        <w:t>RNF02:</w:t>
-      </w:r>
-      <w:r>
-        <w:t xml:space="preserve"> Interface da dashboard simples e responsiva para facilitar o acesso por computadores e smartphones.</w:t>
+        <w:t>RF02:</w:t>
+      </w:r>
+      <w:r>
+        <w:t xml:space="preserve"> Converter a leitura de tensão em uma escala percentual ajustada de 0% (solo seco) a 100% (solo saturado).</w:t>
       </w:r>
     </w:p>
     <w:p>
@@ -2919,6 +3025,139 @@
           <w:b/>
           <w:bCs/>
         </w:rPr>
+        <w:t>RF03:</w:t>
+      </w:r>
+      <w:r>
+        <w:t xml:space="preserve"> Transmitir a leitura percentual via requisição HTTP POST em formato JSON para a API de ingestão.</w:t>
+      </w:r>
+    </w:p>
+    <w:p>
+      <w:pPr>
+        <w:numPr>
+          <w:ilvl w:val="0"/>
+          <w:numId w:val="5"/>
+        </w:numPr>
+      </w:pPr>
+      <w:r>
+        <w:rPr>
+          <w:b/>
+          <w:bCs/>
+        </w:rPr>
+        <w:t>RF04:</w:t>
+      </w:r>
+      <w:r>
+        <w:t xml:space="preserve"> Armazenar os registros com </w:t>
+      </w:r>
+      <w:proofErr w:type="spellStart"/>
+      <w:r>
+        <w:t>timestamp</w:t>
+      </w:r>
+      <w:proofErr w:type="spellEnd"/>
+      <w:r>
+        <w:t xml:space="preserve"> no banco de dados.</w:t>
+      </w:r>
+    </w:p>
+    <w:p>
+      <w:pPr>
+        <w:numPr>
+          <w:ilvl w:val="0"/>
+          <w:numId w:val="5"/>
+        </w:numPr>
+      </w:pPr>
+      <w:r>
+        <w:rPr>
+          <w:b/>
+          <w:bCs/>
+        </w:rPr>
+        <w:t>RF05:</w:t>
+      </w:r>
+      <w:r>
+        <w:t xml:space="preserve"> Exibir em painel web a última leitura e o histórico gráfico do perfil de umidade.</w:t>
+      </w:r>
+    </w:p>
+    <w:p>
+      <w:pPr>
+        <w:widowControl w:val="0"/>
+        <w:pBdr>
+          <w:top w:val="nil"/>
+          <w:left w:val="nil"/>
+          <w:bottom w:val="nil"/>
+          <w:right w:val="nil"/>
+          <w:between w:val="nil"/>
+        </w:pBdr>
+        <w:spacing w:line="276" w:lineRule="auto"/>
+      </w:pPr>
+    </w:p>
+    <w:p>
+      <w:r>
+        <w:rPr>
+          <w:b/>
+          <w:bCs/>
+        </w:rPr>
+        <w:t>Requisitos Não-Funcionais (RNF):</w:t>
+      </w:r>
+    </w:p>
+    <w:p>
+      <w:pPr>
+        <w:widowControl w:val="0"/>
+        <w:pBdr>
+          <w:top w:val="nil"/>
+          <w:left w:val="nil"/>
+          <w:bottom w:val="nil"/>
+          <w:right w:val="nil"/>
+          <w:between w:val="nil"/>
+        </w:pBdr>
+        <w:spacing w:line="276" w:lineRule="auto"/>
+      </w:pPr>
+    </w:p>
+    <w:p>
+      <w:pPr>
+        <w:numPr>
+          <w:ilvl w:val="0"/>
+          <w:numId w:val="5"/>
+        </w:numPr>
+      </w:pPr>
+      <w:r>
+        <w:rPr>
+          <w:b/>
+          <w:bCs/>
+        </w:rPr>
+        <w:t>RNF01:</w:t>
+      </w:r>
+      <w:r>
+        <w:t xml:space="preserve"> Tempo de resposta da API de ingestão inferior a 2 segundos por requisição.</w:t>
+      </w:r>
+    </w:p>
+    <w:p>
+      <w:pPr>
+        <w:numPr>
+          <w:ilvl w:val="0"/>
+          <w:numId w:val="5"/>
+        </w:numPr>
+      </w:pPr>
+      <w:r>
+        <w:rPr>
+          <w:b/>
+          <w:bCs/>
+        </w:rPr>
+        <w:t>RNF02:</w:t>
+      </w:r>
+      <w:r>
+        <w:t xml:space="preserve"> Interface da dashboard simples e responsiva para facilitar o acesso por computadores e smartphones.</w:t>
+      </w:r>
+    </w:p>
+    <w:p>
+      <w:pPr>
+        <w:numPr>
+          <w:ilvl w:val="0"/>
+          <w:numId w:val="5"/>
+        </w:numPr>
+      </w:pPr>
+      <w:r>
+        <w:rPr>
+          <w:b/>
+          <w:bCs/>
+        </w:rPr>
         <w:t>RNF03:</w:t>
       </w:r>
       <w:r>
@@ -2971,6 +3210,7 @@
       <w:bookmarkStart w:id="28" w:name="_e16fs4v3b9mz" w:colFirst="0" w:colLast="0"/>
       <w:bookmarkEnd w:id="28"/>
       <w:r>
+        <w:lastRenderedPageBreak/>
         <w:t>4.4 Módulos do Sistema</w:t>
       </w:r>
     </w:p>
@@ -3038,7 +3278,6 @@
           <w:b/>
           <w:bCs/>
         </w:rPr>
-        <w:lastRenderedPageBreak/>
         <w:t>Módulo de Apresentação (</w:t>
       </w:r>
       <w:proofErr w:type="spellStart"/>
@@ -3128,8 +3367,8 @@
     <w:tbl>
       <w:tblPr>
         <w:tblStyle w:val="a1"/>
-        <w:tblW w:w="14000" w:type="dxa"/>
-        <w:tblInd w:w="0" w:type="dxa"/>
+        <w:tblW w:w="11340" w:type="dxa"/>
+        <w:tblInd w:w="-1134" w:type="dxa"/>
         <w:tblBorders>
           <w:top w:val="single" w:sz="4" w:space="0" w:color="E0E6E3"/>
           <w:left w:val="nil"/>
@@ -3142,10 +3381,10 @@
         <w:tblLook w:val="0620" w:firstRow="1" w:lastRow="0" w:firstColumn="0" w:lastColumn="0" w:noHBand="1" w:noVBand="1"/>
       </w:tblPr>
       <w:tblGrid>
-        <w:gridCol w:w="3500"/>
-        <w:gridCol w:w="3500"/>
-        <w:gridCol w:w="3500"/>
-        <w:gridCol w:w="3500"/>
+        <w:gridCol w:w="1134"/>
+        <w:gridCol w:w="4536"/>
+        <w:gridCol w:w="3828"/>
+        <w:gridCol w:w="1842"/>
       </w:tblGrid>
       <w:tr>
         <w:trPr>
@@ -3154,7 +3393,7 @@
         </w:trPr>
         <w:tc>
           <w:tcPr>
-            <w:tcW w:w="3500" w:type="dxa"/>
+            <w:tcW w:w="1134" w:type="dxa"/>
           </w:tcPr>
           <w:p>
             <w:r>
@@ -3164,7 +3403,7 @@
         </w:tc>
         <w:tc>
           <w:tcPr>
-            <w:tcW w:w="3500" w:type="dxa"/>
+            <w:tcW w:w="4536" w:type="dxa"/>
           </w:tcPr>
           <w:p>
             <w:r>
@@ -3174,7 +3413,7 @@
         </w:tc>
         <w:tc>
           <w:tcPr>
-            <w:tcW w:w="3500" w:type="dxa"/>
+            <w:tcW w:w="3828" w:type="dxa"/>
           </w:tcPr>
           <w:p>
             <w:r>
@@ -3184,7 +3423,7 @@
         </w:tc>
         <w:tc>
           <w:tcPr>
-            <w:tcW w:w="3500" w:type="dxa"/>
+            <w:tcW w:w="1842" w:type="dxa"/>
           </w:tcPr>
           <w:p>
             <w:r>
@@ -3196,7 +3435,7 @@
       <w:tr>
         <w:tc>
           <w:tcPr>
-            <w:tcW w:w="3500" w:type="dxa"/>
+            <w:tcW w:w="1134" w:type="dxa"/>
           </w:tcPr>
           <w:p>
             <w:r>
@@ -3210,7 +3449,7 @@
         </w:tc>
         <w:tc>
           <w:tcPr>
-            <w:tcW w:w="3500" w:type="dxa"/>
+            <w:tcW w:w="4536" w:type="dxa"/>
           </w:tcPr>
           <w:p>
             <w:r>
@@ -3220,7 +3459,7 @@
         </w:tc>
         <w:tc>
           <w:tcPr>
-            <w:tcW w:w="3500" w:type="dxa"/>
+            <w:tcW w:w="3828" w:type="dxa"/>
           </w:tcPr>
           <w:p>
             <w:r>
@@ -3230,7 +3469,7 @@
         </w:tc>
         <w:tc>
           <w:tcPr>
-            <w:tcW w:w="3500" w:type="dxa"/>
+            <w:tcW w:w="1842" w:type="dxa"/>
           </w:tcPr>
           <w:p>
             <w:sdt>
@@ -3255,7 +3494,7 @@
       <w:tr>
         <w:tc>
           <w:tcPr>
-            <w:tcW w:w="3500" w:type="dxa"/>
+            <w:tcW w:w="1134" w:type="dxa"/>
           </w:tcPr>
           <w:p>
             <w:r>
@@ -3269,7 +3508,7 @@
         </w:tc>
         <w:tc>
           <w:tcPr>
-            <w:tcW w:w="3500" w:type="dxa"/>
+            <w:tcW w:w="4536" w:type="dxa"/>
           </w:tcPr>
           <w:p>
             <w:r>
@@ -3279,7 +3518,7 @@
         </w:tc>
         <w:tc>
           <w:tcPr>
-            <w:tcW w:w="3500" w:type="dxa"/>
+            <w:tcW w:w="3828" w:type="dxa"/>
           </w:tcPr>
           <w:p>
             <w:r>
@@ -3289,7 +3528,7 @@
         </w:tc>
         <w:tc>
           <w:tcPr>
-            <w:tcW w:w="3500" w:type="dxa"/>
+            <w:tcW w:w="1842" w:type="dxa"/>
           </w:tcPr>
           <w:p>
             <w:sdt>
@@ -3314,7 +3553,7 @@
       <w:tr>
         <w:tc>
           <w:tcPr>
-            <w:tcW w:w="3500" w:type="dxa"/>
+            <w:tcW w:w="1134" w:type="dxa"/>
           </w:tcPr>
           <w:p>
             <w:r>
@@ -3328,7 +3567,7 @@
         </w:tc>
         <w:tc>
           <w:tcPr>
-            <w:tcW w:w="3500" w:type="dxa"/>
+            <w:tcW w:w="4536" w:type="dxa"/>
           </w:tcPr>
           <w:p>
             <w:r>
@@ -3338,7 +3577,7 @@
         </w:tc>
         <w:tc>
           <w:tcPr>
-            <w:tcW w:w="3500" w:type="dxa"/>
+            <w:tcW w:w="3828" w:type="dxa"/>
           </w:tcPr>
           <w:p>
             <w:r>
@@ -3364,7 +3603,7 @@
         </w:tc>
         <w:tc>
           <w:tcPr>
-            <w:tcW w:w="3500" w:type="dxa"/>
+            <w:tcW w:w="1842" w:type="dxa"/>
           </w:tcPr>
           <w:p>
             <w:sdt>
@@ -3389,7 +3628,7 @@
       <w:tr>
         <w:tc>
           <w:tcPr>
-            <w:tcW w:w="3500" w:type="dxa"/>
+            <w:tcW w:w="1134" w:type="dxa"/>
           </w:tcPr>
           <w:p>
             <w:r>
@@ -3403,7 +3642,7 @@
         </w:tc>
         <w:tc>
           <w:tcPr>
-            <w:tcW w:w="3500" w:type="dxa"/>
+            <w:tcW w:w="4536" w:type="dxa"/>
           </w:tcPr>
           <w:p>
             <w:r>
@@ -3413,7 +3652,7 @@
         </w:tc>
         <w:tc>
           <w:tcPr>
-            <w:tcW w:w="3500" w:type="dxa"/>
+            <w:tcW w:w="3828" w:type="dxa"/>
           </w:tcPr>
           <w:p>
             <w:r>
@@ -3423,7 +3662,7 @@
         </w:tc>
         <w:tc>
           <w:tcPr>
-            <w:tcW w:w="3500" w:type="dxa"/>
+            <w:tcW w:w="1842" w:type="dxa"/>
           </w:tcPr>
           <w:p>
             <w:sdt>
@@ -3448,7 +3687,7 @@
       <w:tr>
         <w:tc>
           <w:tcPr>
-            <w:tcW w:w="3500" w:type="dxa"/>
+            <w:tcW w:w="1134" w:type="dxa"/>
           </w:tcPr>
           <w:p>
             <w:r>
@@ -3462,7 +3701,7 @@
         </w:tc>
         <w:tc>
           <w:tcPr>
-            <w:tcW w:w="3500" w:type="dxa"/>
+            <w:tcW w:w="4536" w:type="dxa"/>
           </w:tcPr>
           <w:p>
             <w:r>
@@ -3472,7 +3711,7 @@
         </w:tc>
         <w:tc>
           <w:tcPr>
-            <w:tcW w:w="3500" w:type="dxa"/>
+            <w:tcW w:w="3828" w:type="dxa"/>
           </w:tcPr>
           <w:p>
             <w:r>
@@ -3482,7 +3721,7 @@
         </w:tc>
         <w:tc>
           <w:tcPr>
-            <w:tcW w:w="3500" w:type="dxa"/>
+            <w:tcW w:w="1842" w:type="dxa"/>
           </w:tcPr>
           <w:p>
             <w:sdt>
@@ -3606,6 +3845,7 @@
       <w:bookmarkStart w:id="32" w:name="_qdblsvgi5vtq" w:colFirst="0" w:colLast="0"/>
       <w:bookmarkEnd w:id="32"/>
       <w:r>
+        <w:lastRenderedPageBreak/>
         <w:t>4.8 Entregáveis e Resultados Esperados</w:t>
       </w:r>
     </w:p>
@@ -3639,7 +3879,6 @@
         </w:numPr>
       </w:pPr>
       <w:r>
-        <w:lastRenderedPageBreak/>
         <w:t>Painel web interativo alimentado em tempo real por dados do sensor.</w:t>
       </w:r>
     </w:p>
@@ -4032,6 +4271,7 @@
         <w:spacing w:after="100"/>
       </w:pPr>
       <w:r>
+        <w:lastRenderedPageBreak/>
         <w:t>4.</w:t>
       </w:r>
       <w:r>
@@ -4062,7 +4302,6 @@
         <w:spacing w:after="100"/>
       </w:pPr>
       <w:r>
-        <w:lastRenderedPageBreak/>
         <w:t>5.</w:t>
       </w:r>
       <w:r>
@@ -4402,69 +4641,44 @@
         <w:t>$$\</w:t>
       </w:r>
       <w:proofErr w:type="spellStart"/>
-      <w:proofErr w:type="gramStart"/>
       <w:r>
         <w:t>text</w:t>
       </w:r>
       <w:proofErr w:type="spellEnd"/>
       <w:r>
+        <w:t>{Umidade (%)} = \</w:t>
+      </w:r>
+      <w:proofErr w:type="spellStart"/>
+      <w:r>
+        <w:t>left</w:t>
+      </w:r>
+      <w:proofErr w:type="spellEnd"/>
+      <w:r>
+        <w:t>( 1 - \</w:t>
+      </w:r>
+      <w:proofErr w:type="spellStart"/>
+      <w:r>
+        <w:t>frac</w:t>
+      </w:r>
+      <w:proofErr w:type="spellEnd"/>
+      <w:r>
+        <w:t>{\</w:t>
+      </w:r>
+      <w:proofErr w:type="spellStart"/>
+      <w:r>
+        <w:t>text</w:t>
+      </w:r>
+      <w:proofErr w:type="spellEnd"/>
+      <w:r>
         <w:t>{</w:t>
       </w:r>
-      <w:proofErr w:type="gramEnd"/>
-      <w:r>
-        <w:t>Umidade (%)} = \</w:t>
-      </w:r>
       <w:proofErr w:type="spellStart"/>
-      <w:proofErr w:type="gramStart"/>
-      <w:r>
-        <w:t>left</w:t>
+      <w:r>
+        <w:t>Leitura_Atual</w:t>
       </w:r>
       <w:proofErr w:type="spellEnd"/>
       <w:r>
-        <w:t>( 1</w:t>
-      </w:r>
-      <w:proofErr w:type="gramEnd"/>
-      <w:r>
-        <w:t xml:space="preserve"> - \</w:t>
-      </w:r>
-      <w:proofErr w:type="spellStart"/>
-      <w:r>
-        <w:t>frac</w:t>
-      </w:r>
-      <w:proofErr w:type="spellEnd"/>
-      <w:r>
-        <w:t>{\</w:t>
-      </w:r>
-      <w:proofErr w:type="spellStart"/>
-      <w:proofErr w:type="gramStart"/>
-      <w:r>
-        <w:t>text</w:t>
-      </w:r>
-      <w:proofErr w:type="spellEnd"/>
-      <w:r>
-        <w:t>{</w:t>
-      </w:r>
-      <w:proofErr w:type="spellStart"/>
-      <w:proofErr w:type="gramEnd"/>
-      <w:r>
-        <w:t>Leitura</w:t>
-      </w:r>
-      <w:proofErr w:type="gramStart"/>
-      <w:r>
-        <w:t>_Atual</w:t>
-      </w:r>
-      <w:proofErr w:type="spellEnd"/>
-      <w:proofErr w:type="gramEnd"/>
-      <w:r>
-        <w:t>} - V_{sat</w:t>
-      </w:r>
-      <w:proofErr w:type="gramStart"/>
-      <w:r>
-        <w:t>}}{</w:t>
-      </w:r>
-      <w:proofErr w:type="gramEnd"/>
-      <w:r>
-        <w:t>V_{seco} - V_{sat}} \</w:t>
+        <w:t>} - V_{sat}}{V_{seco} - V_{sat}} \</w:t>
       </w:r>
       <w:proofErr w:type="spellStart"/>
       <w:r>
@@ -4789,8 +5003,8 @@
     <w:tbl>
       <w:tblPr>
         <w:tblStyle w:val="a2"/>
-        <w:tblW w:w="14000" w:type="dxa"/>
-        <w:tblInd w:w="0" w:type="dxa"/>
+        <w:tblW w:w="11199" w:type="dxa"/>
+        <w:tblInd w:w="-993" w:type="dxa"/>
         <w:tblBorders>
           <w:top w:val="single" w:sz="4" w:space="0" w:color="E0E6E3"/>
           <w:left w:val="nil"/>
@@ -4803,19 +5017,20 @@
         <w:tblLook w:val="0620" w:firstRow="1" w:lastRow="0" w:firstColumn="0" w:lastColumn="0" w:noHBand="1" w:noVBand="1"/>
       </w:tblPr>
       <w:tblGrid>
-        <w:gridCol w:w="3500"/>
-        <w:gridCol w:w="3500"/>
-        <w:gridCol w:w="3500"/>
-        <w:gridCol w:w="3500"/>
+        <w:gridCol w:w="2747"/>
+        <w:gridCol w:w="2215"/>
+        <w:gridCol w:w="2552"/>
+        <w:gridCol w:w="3685"/>
       </w:tblGrid>
       <w:tr>
         <w:trPr>
           <w:cnfStyle w:val="100000000000" w:firstRow="1" w:lastRow="0" w:firstColumn="0" w:lastColumn="0" w:oddVBand="0" w:evenVBand="0" w:oddHBand="0" w:evenHBand="0" w:firstRowFirstColumn="0" w:firstRowLastColumn="0" w:lastRowFirstColumn="0" w:lastRowLastColumn="0"/>
+          <w:trHeight w:val="689"/>
           <w:tblHeader/>
         </w:trPr>
         <w:tc>
           <w:tcPr>
-            <w:tcW w:w="3500" w:type="dxa"/>
+            <w:tcW w:w="2747" w:type="dxa"/>
           </w:tcPr>
           <w:p>
             <w:r>
@@ -4825,7 +5040,7 @@
         </w:tc>
         <w:tc>
           <w:tcPr>
-            <w:tcW w:w="3500" w:type="dxa"/>
+            <w:tcW w:w="2215" w:type="dxa"/>
           </w:tcPr>
           <w:p>
             <w:r>
@@ -4835,7 +5050,7 @@
         </w:tc>
         <w:tc>
           <w:tcPr>
-            <w:tcW w:w="3500" w:type="dxa"/>
+            <w:tcW w:w="2552" w:type="dxa"/>
           </w:tcPr>
           <w:p>
             <w:r>
@@ -4845,7 +5060,7 @@
         </w:tc>
         <w:tc>
           <w:tcPr>
-            <w:tcW w:w="3500" w:type="dxa"/>
+            <w:tcW w:w="3685" w:type="dxa"/>
           </w:tcPr>
           <w:p>
             <w:r>
@@ -4857,7 +5072,7 @@
       <w:tr>
         <w:tc>
           <w:tcPr>
-            <w:tcW w:w="3500" w:type="dxa"/>
+            <w:tcW w:w="2747" w:type="dxa"/>
           </w:tcPr>
           <w:p>
             <w:r>
@@ -4871,7 +5086,7 @@
         </w:tc>
         <w:tc>
           <w:tcPr>
-            <w:tcW w:w="3500" w:type="dxa"/>
+            <w:tcW w:w="2215" w:type="dxa"/>
           </w:tcPr>
           <w:p>
             <w:r>
@@ -4881,7 +5096,7 @@
         </w:tc>
         <w:tc>
           <w:tcPr>
-            <w:tcW w:w="3500" w:type="dxa"/>
+            <w:tcW w:w="2552" w:type="dxa"/>
           </w:tcPr>
           <w:p>
             <w:r>
@@ -4891,7 +5106,7 @@
         </w:tc>
         <w:tc>
           <w:tcPr>
-            <w:tcW w:w="3500" w:type="dxa"/>
+            <w:tcW w:w="3685" w:type="dxa"/>
           </w:tcPr>
           <w:p>
             <w:r>
@@ -4903,7 +5118,7 @@
       <w:tr>
         <w:tc>
           <w:tcPr>
-            <w:tcW w:w="3500" w:type="dxa"/>
+            <w:tcW w:w="2747" w:type="dxa"/>
           </w:tcPr>
           <w:p>
             <w:r>
@@ -4917,7 +5132,7 @@
         </w:tc>
         <w:tc>
           <w:tcPr>
-            <w:tcW w:w="3500" w:type="dxa"/>
+            <w:tcW w:w="2215" w:type="dxa"/>
           </w:tcPr>
           <w:p>
             <w:r>
@@ -4927,14 +5142,12 @@
         </w:tc>
         <w:tc>
           <w:tcPr>
-            <w:tcW w:w="3500" w:type="dxa"/>
+            <w:tcW w:w="2552" w:type="dxa"/>
           </w:tcPr>
           <w:p>
-            <w:proofErr w:type="spellStart"/>
             <w:r>
-              <w:t>Mau</w:t>
+              <w:t>Mal</w:t>
             </w:r>
-            <w:proofErr w:type="spellEnd"/>
             <w:r>
               <w:t xml:space="preserve"> contato elétrico ou leituras erráticas</w:t>
             </w:r>
@@ -4942,7 +5155,7 @@
         </w:tc>
         <w:tc>
           <w:tcPr>
-            <w:tcW w:w="3500" w:type="dxa"/>
+            <w:tcW w:w="3685" w:type="dxa"/>
           </w:tcPr>
           <w:p>
             <w:r>
@@ -4952,9 +5165,12 @@
         </w:tc>
       </w:tr>
       <w:tr>
+        <w:trPr>
+          <w:trHeight w:val="20"/>
+        </w:trPr>
         <w:tc>
           <w:tcPr>
-            <w:tcW w:w="3500" w:type="dxa"/>
+            <w:tcW w:w="2747" w:type="dxa"/>
           </w:tcPr>
           <w:p>
             <w:proofErr w:type="spellStart"/>
@@ -4977,7 +5193,7 @@
         </w:tc>
         <w:tc>
           <w:tcPr>
-            <w:tcW w:w="3500" w:type="dxa"/>
+            <w:tcW w:w="2215" w:type="dxa"/>
           </w:tcPr>
           <w:p>
             <w:r>
@@ -4987,7 +5203,7 @@
         </w:tc>
         <w:tc>
           <w:tcPr>
-            <w:tcW w:w="3500" w:type="dxa"/>
+            <w:tcW w:w="2552" w:type="dxa"/>
           </w:tcPr>
           <w:p>
             <w:r>
@@ -4997,7 +5213,7 @@
         </w:tc>
         <w:tc>
           <w:tcPr>
-            <w:tcW w:w="3500" w:type="dxa"/>
+            <w:tcW w:w="3685" w:type="dxa"/>
           </w:tcPr>
           <w:p>
             <w:r>
@@ -5007,9 +5223,12 @@
         </w:tc>
       </w:tr>
       <w:tr>
+        <w:trPr>
+          <w:trHeight w:val="1964"/>
+        </w:trPr>
         <w:tc>
           <w:tcPr>
-            <w:tcW w:w="3500" w:type="dxa"/>
+            <w:tcW w:w="2747" w:type="dxa"/>
           </w:tcPr>
           <w:p>
             <w:r>
@@ -5017,13 +5236,14 @@
                 <w:b/>
                 <w:bCs/>
               </w:rPr>
+              <w:lastRenderedPageBreak/>
               <w:t>Falha de Alimentação</w:t>
             </w:r>
           </w:p>
         </w:tc>
         <w:tc>
           <w:tcPr>
-            <w:tcW w:w="3500" w:type="dxa"/>
+            <w:tcW w:w="2215" w:type="dxa"/>
           </w:tcPr>
           <w:p>
             <w:r>
@@ -5033,7 +5253,7 @@
         </w:tc>
         <w:tc>
           <w:tcPr>
-            <w:tcW w:w="3500" w:type="dxa"/>
+            <w:tcW w:w="2552" w:type="dxa"/>
           </w:tcPr>
           <w:p>
             <w:r>
@@ -5043,7 +5263,7 @@
         </w:tc>
         <w:tc>
           <w:tcPr>
-            <w:tcW w:w="3500" w:type="dxa"/>
+            <w:tcW w:w="3685" w:type="dxa"/>
           </w:tcPr>
           <w:p>
             <w:r>
@@ -5088,7 +5308,6 @@
       <w:bookmarkStart w:id="44" w:name="_50q6nb446ann" w:colFirst="0" w:colLast="0"/>
       <w:bookmarkEnd w:id="44"/>
       <w:r>
-        <w:lastRenderedPageBreak/>
         <w:t>8. REFERÊNCIAS BIBLIOGRÁFICAS</w:t>
       </w:r>
     </w:p>
@@ -5249,13 +5468,8 @@
           <w:numId w:val="10"/>
         </w:numPr>
       </w:pPr>
-      <w:proofErr w:type="gramStart"/>
-      <w:r>
-        <w:t>DIALOGUE</w:t>
-      </w:r>
-      <w:proofErr w:type="gramEnd"/>
-      <w:r>
-        <w:t xml:space="preserve"> EARTH. </w:t>
+      <w:r>
+        <w:t xml:space="preserve">DIALOGUE EARTH. </w:t>
       </w:r>
       <w:r>
         <w:rPr>
@@ -5354,13 +5568,8 @@
           <w:numId w:val="10"/>
         </w:numPr>
       </w:pPr>
-      <w:proofErr w:type="gramStart"/>
-      <w:r>
-        <w:t>CURTO CIRCUITO</w:t>
-      </w:r>
-      <w:proofErr w:type="gramEnd"/>
-      <w:r>
-        <w:t xml:space="preserve">. </w:t>
+      <w:r>
+        <w:t xml:space="preserve">CURTO CIRCUITO. </w:t>
       </w:r>
       <w:r>
         <w:rPr>
@@ -5370,15 +5579,7 @@
         <w:t>Sensores de umidade de solo: tipos e diferenças</w:t>
       </w:r>
       <w:r>
-        <w:t xml:space="preserve">. [S. l.]: </w:t>
-      </w:r>
-      <w:proofErr w:type="gramStart"/>
-      <w:r>
-        <w:t>Curto Circuito</w:t>
-      </w:r>
-      <w:proofErr w:type="gramEnd"/>
-      <w:r>
-        <w:t>, 2025.</w:t>
+        <w:t>. [S. l.]: Curto Circuito, 2025.</w:t>
       </w:r>
     </w:p>
     <w:p>

</xml_diff>